<commit_message>
updated my projects and cv
</commit_message>
<xml_diff>
--- a/assets/cv/Felix-Adewale-CV.docx
+++ b/assets/cv/Felix-Adewale-CV.docx
@@ -35,7 +35,7 @@
           <w:sz w:val="48"/>
           <w:szCs w:val="48"/>
         </w:rPr>
-        <w:t xml:space="preserve"> Felix </w:t>
+        <w:t xml:space="preserve"> </w:t>
       </w:r>
       <w:proofErr w:type="spellStart"/>
       <w:r>
@@ -61,7 +61,6 @@
         </w:rPr>
         <w:t xml:space="preserve"> </w:t>
       </w:r>
-      <w:proofErr w:type="spellStart"/>
       <w:r>
         <w:rPr>
           <w:rFonts w:ascii="Times New Roman" w:eastAsia="Times New Roman" w:hAnsi="Times New Roman" w:cs="Times New Roman"/>
@@ -71,9 +70,9 @@
           <w:sz w:val="48"/>
           <w:szCs w:val="48"/>
         </w:rPr>
-        <w:t>Adewale</w:t>
-      </w:r>
-      <w:proofErr w:type="spellEnd"/>
+        <w:t xml:space="preserve">Felix </w:t>
+      </w:r>
+      <w:proofErr w:type="spellStart"/>
       <w:r>
         <w:rPr>
           <w:rFonts w:ascii="Times New Roman" w:eastAsia="Times New Roman" w:hAnsi="Times New Roman" w:cs="Times New Roman"/>
@@ -83,8 +82,22 @@
           <w:sz w:val="48"/>
           <w:szCs w:val="48"/>
         </w:rPr>
+        <w:t>Adewale</w:t>
+      </w:r>
+      <w:proofErr w:type="spellEnd"/>
+      <w:r>
+        <w:rPr>
+          <w:rFonts w:ascii="Times New Roman" w:eastAsia="Times New Roman" w:hAnsi="Times New Roman" w:cs="Times New Roman"/>
+          <w:b/>
+          <w:bCs/>
+          <w:kern w:val="36"/>
+          <w:sz w:val="48"/>
+          <w:szCs w:val="48"/>
+        </w:rPr>
         <w:t xml:space="preserve"> – Web Developer Portfolio</w:t>
       </w:r>
+      <w:bookmarkStart w:id="0" w:name="_GoBack"/>
+      <w:bookmarkEnd w:id="0"/>
     </w:p>
     <w:p>
       <w:pPr>
@@ -190,7 +203,39 @@
           <w:sz w:val="24"/>
           <w:szCs w:val="24"/>
         </w:rPr>
-        <w:t xml:space="preserve">, having managed healthcare IT systems, developed enterprise portals, and taught digital skills. I specialize in </w:t>
+        <w:t xml:space="preserve">, having managed healthcare IT systems, developed </w:t>
+      </w:r>
+      <w:r>
+        <w:rPr>
+          <w:rFonts w:ascii="Times New Roman" w:eastAsia="Times New Roman" w:hAnsi="Times New Roman" w:cs="Times New Roman"/>
+          <w:sz w:val="24"/>
+          <w:szCs w:val="24"/>
+        </w:rPr>
+        <w:t>Enterprise</w:t>
+      </w:r>
+      <w:r>
+        <w:rPr>
+          <w:rFonts w:ascii="Times New Roman" w:eastAsia="Times New Roman" w:hAnsi="Times New Roman" w:cs="Times New Roman"/>
+          <w:sz w:val="24"/>
+          <w:szCs w:val="24"/>
+        </w:rPr>
+        <w:t xml:space="preserve"> Resource Planning (ERP)</w:t>
+      </w:r>
+      <w:r>
+        <w:rPr>
+          <w:rFonts w:ascii="Times New Roman" w:eastAsia="Times New Roman" w:hAnsi="Times New Roman" w:cs="Times New Roman"/>
+          <w:sz w:val="24"/>
+          <w:szCs w:val="24"/>
+        </w:rPr>
+        <w:t xml:space="preserve"> </w:t>
+      </w:r>
+      <w:r>
+        <w:rPr>
+          <w:rFonts w:ascii="Times New Roman" w:eastAsia="Times New Roman" w:hAnsi="Times New Roman" w:cs="Times New Roman"/>
+          <w:sz w:val="24"/>
+          <w:szCs w:val="24"/>
+        </w:rPr>
+        <w:t xml:space="preserve">portals, and taught digital skills. I specialize in </w:t>
       </w:r>
       <w:proofErr w:type="spellStart"/>
       <w:r>
@@ -212,7 +257,47 @@
           <w:sz w:val="24"/>
           <w:szCs w:val="24"/>
         </w:rPr>
-        <w:t>, P</w:t>
+        <w:t>,</w:t>
+      </w:r>
+      <w:r>
+        <w:rPr>
+          <w:rFonts w:ascii="Times New Roman" w:eastAsia="Times New Roman" w:hAnsi="Times New Roman" w:cs="Times New Roman"/>
+          <w:b/>
+          <w:bCs/>
+          <w:sz w:val="24"/>
+          <w:szCs w:val="24"/>
+        </w:rPr>
+        <w:t xml:space="preserve"> React,</w:t>
+      </w:r>
+      <w:r>
+        <w:rPr>
+          <w:rFonts w:ascii="Times New Roman" w:eastAsia="Times New Roman" w:hAnsi="Times New Roman" w:cs="Times New Roman"/>
+          <w:b/>
+          <w:bCs/>
+          <w:sz w:val="24"/>
+          <w:szCs w:val="24"/>
+        </w:rPr>
+        <w:t xml:space="preserve"> </w:t>
+      </w:r>
+      <w:r>
+        <w:rPr>
+          <w:rFonts w:ascii="Times New Roman" w:eastAsia="Times New Roman" w:hAnsi="Times New Roman" w:cs="Times New Roman"/>
+          <w:b/>
+          <w:bCs/>
+          <w:sz w:val="24"/>
+          <w:szCs w:val="24"/>
+        </w:rPr>
+        <w:t xml:space="preserve">JavaScript, </w:t>
+      </w:r>
+      <w:r>
+        <w:rPr>
+          <w:rFonts w:ascii="Times New Roman" w:eastAsia="Times New Roman" w:hAnsi="Times New Roman" w:cs="Times New Roman"/>
+          <w:b/>
+          <w:bCs/>
+          <w:sz w:val="24"/>
+          <w:szCs w:val="24"/>
+        </w:rPr>
+        <w:t>P</w:t>
       </w:r>
       <w:r>
         <w:rPr>
@@ -286,7 +371,17 @@
           <w:sz w:val="24"/>
           <w:szCs w:val="24"/>
         </w:rPr>
-        <w:t xml:space="preserve"> Bootstrap, JavaScript, React, and API development</w:t>
+        <w:t xml:space="preserve"> Bootstrap, and API development</w:t>
+      </w:r>
+      <w:r>
+        <w:rPr>
+          <w:rFonts w:ascii="Times New Roman" w:eastAsia="Times New Roman" w:hAnsi="Times New Roman" w:cs="Times New Roman"/>
+          <w:b/>
+          <w:bCs/>
+          <w:sz w:val="24"/>
+          <w:szCs w:val="24"/>
+        </w:rPr>
+        <w:t>-&gt;(Sanctum)</w:t>
       </w:r>
       <w:r>
         <w:rPr>
@@ -304,7 +399,47 @@
           <w:sz w:val="24"/>
           <w:szCs w:val="24"/>
         </w:rPr>
-        <w:t>e-commerce, healthcare portals, and school management systems</w:t>
+        <w:t>e-commerce, healthcare portals,</w:t>
+      </w:r>
+      <w:r>
+        <w:rPr>
+          <w:rFonts w:ascii="Times New Roman" w:eastAsia="Times New Roman" w:hAnsi="Times New Roman" w:cs="Times New Roman"/>
+          <w:b/>
+          <w:bCs/>
+          <w:sz w:val="24"/>
+          <w:szCs w:val="24"/>
+        </w:rPr>
+        <w:t xml:space="preserve"> HR-Management, Attendance tracking web App, Artisan Web App for South-west Nigeria, HMS-EMR</w:t>
+      </w:r>
+      <w:r>
+        <w:rPr>
+          <w:rFonts w:ascii="Times New Roman" w:eastAsia="Times New Roman" w:hAnsi="Times New Roman" w:cs="Times New Roman"/>
+          <w:b/>
+          <w:bCs/>
+          <w:sz w:val="24"/>
+          <w:szCs w:val="24"/>
+        </w:rPr>
+        <w:t xml:space="preserve"> </w:t>
+      </w:r>
+      <w:r>
+        <w:rPr>
+          <w:rFonts w:ascii="Times New Roman" w:eastAsia="Times New Roman" w:hAnsi="Times New Roman" w:cs="Times New Roman"/>
+          <w:b/>
+          <w:bCs/>
+          <w:sz w:val="24"/>
+          <w:szCs w:val="24"/>
+        </w:rPr>
+        <w:t xml:space="preserve">portal, Retirees verification System </w:t>
+      </w:r>
+      <w:r>
+        <w:rPr>
+          <w:rFonts w:ascii="Times New Roman" w:eastAsia="Times New Roman" w:hAnsi="Times New Roman" w:cs="Times New Roman"/>
+          <w:b/>
+          <w:bCs/>
+          <w:sz w:val="24"/>
+          <w:szCs w:val="24"/>
+        </w:rPr>
+        <w:t>and school management systems</w:t>
       </w:r>
       <w:r>
         <w:rPr>
@@ -340,7 +475,37 @@
           <w:sz w:val="24"/>
           <w:szCs w:val="24"/>
         </w:rPr>
-        <w:t>healthcare, education, and business automation</w:t>
+        <w:t xml:space="preserve">healthcare, education, </w:t>
+      </w:r>
+      <w:r>
+        <w:rPr>
+          <w:rFonts w:ascii="Times New Roman" w:eastAsia="Times New Roman" w:hAnsi="Times New Roman" w:cs="Times New Roman"/>
+          <w:b/>
+          <w:bCs/>
+          <w:sz w:val="24"/>
+          <w:szCs w:val="24"/>
+        </w:rPr>
+        <w:t xml:space="preserve">administrative </w:t>
+      </w:r>
+      <w:r>
+        <w:rPr>
+          <w:rFonts w:ascii="Times New Roman" w:eastAsia="Times New Roman" w:hAnsi="Times New Roman" w:cs="Times New Roman"/>
+          <w:b/>
+          <w:bCs/>
+          <w:sz w:val="24"/>
+          <w:szCs w:val="24"/>
+        </w:rPr>
+        <w:t>and business automation</w:t>
+      </w:r>
+      <w:r>
+        <w:rPr>
+          <w:rFonts w:ascii="Times New Roman" w:eastAsia="Times New Roman" w:hAnsi="Times New Roman" w:cs="Times New Roman"/>
+          <w:b/>
+          <w:bCs/>
+          <w:sz w:val="24"/>
+          <w:szCs w:val="24"/>
+        </w:rPr>
+        <w:t>s</w:t>
       </w:r>
       <w:r>
         <w:rPr>
@@ -349,26 +514,6 @@
           <w:szCs w:val="24"/>
         </w:rPr>
         <w:t>.</w:t>
-      </w:r>
-    </w:p>
-    <w:p>
-      <w:pPr>
-        <w:spacing w:after="0" w:line="240" w:lineRule="auto"/>
-        <w:rPr>
-          <w:rFonts w:ascii="Times New Roman" w:eastAsia="Times New Roman" w:hAnsi="Times New Roman" w:cs="Times New Roman"/>
-          <w:sz w:val="24"/>
-          <w:szCs w:val="24"/>
-        </w:rPr>
-      </w:pPr>
-      <w:r>
-        <w:rPr>
-          <w:rFonts w:ascii="Times New Roman" w:eastAsia="Times New Roman" w:hAnsi="Times New Roman" w:cs="Times New Roman"/>
-          <w:sz w:val="24"/>
-          <w:szCs w:val="24"/>
-        </w:rPr>
-        <w:pict>
-          <v:rect id="_x0000_i1025" style="width:0;height:1.5pt" o:hralign="center" o:hrstd="t" o:hr="t" fillcolor="#a0a0a0" stroked="f"/>
-        </w:pict>
       </w:r>
     </w:p>
     <w:p>
@@ -435,6 +580,14 @@
         </w:rPr>
         <w:t xml:space="preserve"> HTML5, CSS3, JavaScript (ES6+), Bootstrap, Tailwind, React</w:t>
       </w:r>
+      <w:r>
+        <w:rPr>
+          <w:rFonts w:ascii="Times New Roman" w:eastAsia="Times New Roman" w:hAnsi="Times New Roman" w:cs="Times New Roman"/>
+          <w:sz w:val="24"/>
+          <w:szCs w:val="24"/>
+        </w:rPr>
+        <w:t>.js</w:t>
+      </w:r>
     </w:p>
     <w:p>
       <w:pPr>
@@ -465,7 +618,7 @@
           <w:sz w:val="24"/>
           <w:szCs w:val="24"/>
         </w:rPr>
-        <w:t xml:space="preserve"> PHP (Procedural + OOP), REST APIs, MySQL (</w:t>
+        <w:t xml:space="preserve"> </w:t>
       </w:r>
       <w:proofErr w:type="spellStart"/>
       <w:r>
@@ -474,7 +627,7 @@
           <w:sz w:val="24"/>
           <w:szCs w:val="24"/>
         </w:rPr>
-        <w:t>MySQLi</w:t>
+        <w:t>Laravel</w:t>
       </w:r>
       <w:proofErr w:type="spellEnd"/>
       <w:r>
@@ -483,26 +636,24 @@
           <w:sz w:val="24"/>
           <w:szCs w:val="24"/>
         </w:rPr>
-        <w:t>)</w:t>
-      </w:r>
-      <w:r>
-        <w:rPr>
-          <w:rFonts w:ascii="Times New Roman" w:eastAsia="Times New Roman" w:hAnsi="Times New Roman" w:cs="Times New Roman"/>
-          <w:sz w:val="24"/>
-          <w:szCs w:val="24"/>
-        </w:rPr>
-        <w:t xml:space="preserve"> and </w:t>
-      </w:r>
-      <w:proofErr w:type="spellStart"/>
-      <w:r>
-        <w:rPr>
-          <w:rFonts w:ascii="Times New Roman" w:eastAsia="Times New Roman" w:hAnsi="Times New Roman" w:cs="Times New Roman"/>
-          <w:sz w:val="24"/>
-          <w:szCs w:val="24"/>
-        </w:rPr>
-        <w:t>Laravel</w:t>
-      </w:r>
-      <w:proofErr w:type="spellEnd"/>
+        <w:t>,</w:t>
+      </w:r>
+      <w:r>
+        <w:rPr>
+          <w:rFonts w:ascii="Times New Roman" w:eastAsia="Times New Roman" w:hAnsi="Times New Roman" w:cs="Times New Roman"/>
+          <w:sz w:val="24"/>
+          <w:szCs w:val="24"/>
+        </w:rPr>
+        <w:t xml:space="preserve"> </w:t>
+      </w:r>
+      <w:r>
+        <w:rPr>
+          <w:rFonts w:ascii="Times New Roman" w:eastAsia="Times New Roman" w:hAnsi="Times New Roman" w:cs="Times New Roman"/>
+          <w:sz w:val="24"/>
+          <w:szCs w:val="24"/>
+        </w:rPr>
+        <w:t xml:space="preserve">PHP (Procedural), REST APIs, MySQL </w:t>
+      </w:r>
     </w:p>
     <w:p>
       <w:pPr>
@@ -581,13 +732,49 @@
         <w:t>htaccess</w:t>
       </w:r>
       <w:proofErr w:type="spellEnd"/>
-      <w:r>
-        <w:rPr>
-          <w:rFonts w:ascii="Times New Roman" w:eastAsia="Times New Roman" w:hAnsi="Times New Roman" w:cs="Times New Roman"/>
-          <w:sz w:val="24"/>
-          <w:szCs w:val="24"/>
-        </w:rPr>
-        <w:t>, XAMPP/LAMP</w:t>
+      <w:proofErr w:type="gramStart"/>
+      <w:r>
+        <w:rPr>
+          <w:rFonts w:ascii="Times New Roman" w:eastAsia="Times New Roman" w:hAnsi="Times New Roman" w:cs="Times New Roman"/>
+          <w:sz w:val="24"/>
+          <w:szCs w:val="24"/>
+        </w:rPr>
+        <w:t xml:space="preserve">, </w:t>
+      </w:r>
+      <w:r>
+        <w:rPr>
+          <w:rFonts w:ascii="Times New Roman" w:eastAsia="Times New Roman" w:hAnsi="Times New Roman" w:cs="Times New Roman"/>
+          <w:sz w:val="24"/>
+          <w:szCs w:val="24"/>
+        </w:rPr>
+        <w:t>.</w:t>
+      </w:r>
+      <w:proofErr w:type="spellStart"/>
+      <w:r>
+        <w:rPr>
+          <w:rFonts w:ascii="Times New Roman" w:eastAsia="Times New Roman" w:hAnsi="Times New Roman" w:cs="Times New Roman"/>
+          <w:sz w:val="24"/>
+          <w:szCs w:val="24"/>
+        </w:rPr>
+        <w:t>env</w:t>
+      </w:r>
+      <w:proofErr w:type="spellEnd"/>
+      <w:proofErr w:type="gramEnd"/>
+      <w:r>
+        <w:rPr>
+          <w:rFonts w:ascii="Times New Roman" w:eastAsia="Times New Roman" w:hAnsi="Times New Roman" w:cs="Times New Roman"/>
+          <w:sz w:val="24"/>
+          <w:szCs w:val="24"/>
+        </w:rPr>
+        <w:t xml:space="preserve">, </w:t>
+      </w:r>
+      <w:r>
+        <w:rPr>
+          <w:rFonts w:ascii="Times New Roman" w:eastAsia="Times New Roman" w:hAnsi="Times New Roman" w:cs="Times New Roman"/>
+          <w:sz w:val="24"/>
+          <w:szCs w:val="24"/>
+        </w:rPr>
+        <w:t>XAMPP</w:t>
       </w:r>
     </w:p>
     <w:p>
@@ -624,22 +811,280 @@
     </w:p>
     <w:p>
       <w:pPr>
-        <w:spacing w:after="0" w:line="240" w:lineRule="auto"/>
-        <w:rPr>
-          <w:rFonts w:ascii="Times New Roman" w:eastAsia="Times New Roman" w:hAnsi="Times New Roman" w:cs="Times New Roman"/>
-          <w:sz w:val="24"/>
-          <w:szCs w:val="24"/>
-        </w:rPr>
-      </w:pPr>
-      <w:r>
-        <w:rPr>
-          <w:rFonts w:ascii="Times New Roman" w:eastAsia="Times New Roman" w:hAnsi="Times New Roman" w:cs="Times New Roman"/>
-          <w:sz w:val="24"/>
-          <w:szCs w:val="24"/>
-        </w:rPr>
-        <w:pict>
-          <v:rect id="_x0000_i1026" style="width:0;height:1.5pt" o:hralign="center" o:hrstd="t" o:hr="t" fillcolor="#a0a0a0" stroked="f"/>
-        </w:pict>
+        <w:numPr>
+          <w:ilvl w:val="0"/>
+          <w:numId w:val="1"/>
+        </w:numPr>
+        <w:spacing w:before="100" w:beforeAutospacing="1" w:after="100" w:afterAutospacing="1" w:line="240" w:lineRule="auto"/>
+        <w:rPr>
+          <w:rFonts w:ascii="Times New Roman" w:eastAsia="Times New Roman" w:hAnsi="Times New Roman" w:cs="Times New Roman"/>
+          <w:sz w:val="24"/>
+          <w:szCs w:val="24"/>
+        </w:rPr>
+      </w:pPr>
+      <w:r>
+        <w:rPr>
+          <w:rFonts w:ascii="Times New Roman" w:eastAsia="Times New Roman" w:hAnsi="Times New Roman" w:cs="Times New Roman"/>
+          <w:b/>
+          <w:bCs/>
+          <w:sz w:val="24"/>
+          <w:szCs w:val="24"/>
+        </w:rPr>
+        <w:t xml:space="preserve">AI </w:t>
+      </w:r>
+      <w:r>
+        <w:rPr>
+          <w:rFonts w:ascii="Times New Roman" w:eastAsia="Times New Roman" w:hAnsi="Times New Roman" w:cs="Times New Roman"/>
+          <w:b/>
+          <w:bCs/>
+          <w:sz w:val="24"/>
+          <w:szCs w:val="24"/>
+        </w:rPr>
+        <w:t xml:space="preserve">Agentic </w:t>
+      </w:r>
+      <w:proofErr w:type="gramStart"/>
+      <w:r>
+        <w:rPr>
+          <w:rFonts w:ascii="Times New Roman" w:eastAsia="Times New Roman" w:hAnsi="Times New Roman" w:cs="Times New Roman"/>
+          <w:b/>
+          <w:bCs/>
+          <w:sz w:val="24"/>
+          <w:szCs w:val="24"/>
+        </w:rPr>
+        <w:t>coding</w:t>
+      </w:r>
+      <w:proofErr w:type="gramEnd"/>
+      <w:r>
+        <w:rPr>
+          <w:rFonts w:ascii="Times New Roman" w:eastAsia="Times New Roman" w:hAnsi="Times New Roman" w:cs="Times New Roman"/>
+          <w:b/>
+          <w:bCs/>
+          <w:sz w:val="24"/>
+          <w:szCs w:val="24"/>
+        </w:rPr>
+        <w:t xml:space="preserve"> </w:t>
+      </w:r>
+      <w:r>
+        <w:rPr>
+          <w:rFonts w:ascii="Times New Roman" w:eastAsia="Times New Roman" w:hAnsi="Times New Roman" w:cs="Times New Roman"/>
+          <w:b/>
+          <w:bCs/>
+          <w:sz w:val="24"/>
+          <w:szCs w:val="24"/>
+        </w:rPr>
+        <w:t xml:space="preserve">Tools </w:t>
+      </w:r>
+      <w:r>
+        <w:rPr>
+          <w:rFonts w:ascii="Times New Roman" w:eastAsia="Times New Roman" w:hAnsi="Times New Roman" w:cs="Times New Roman"/>
+          <w:b/>
+          <w:bCs/>
+          <w:sz w:val="24"/>
+          <w:szCs w:val="24"/>
+        </w:rPr>
+        <w:t xml:space="preserve">+ </w:t>
+      </w:r>
+      <w:r>
+        <w:rPr>
+          <w:rFonts w:ascii="Times New Roman" w:eastAsia="Times New Roman" w:hAnsi="Times New Roman" w:cs="Times New Roman"/>
+          <w:b/>
+          <w:bCs/>
+          <w:sz w:val="24"/>
+          <w:szCs w:val="24"/>
+        </w:rPr>
+        <w:t>CLI:</w:t>
+      </w:r>
+      <w:r>
+        <w:rPr>
+          <w:rFonts w:ascii="Times New Roman" w:eastAsia="Times New Roman" w:hAnsi="Times New Roman" w:cs="Times New Roman"/>
+          <w:sz w:val="24"/>
+          <w:szCs w:val="24"/>
+        </w:rPr>
+        <w:t xml:space="preserve"> Google-Antigravity, </w:t>
+      </w:r>
+      <w:proofErr w:type="spellStart"/>
+      <w:r>
+        <w:rPr>
+          <w:rFonts w:ascii="Times New Roman" w:eastAsia="Times New Roman" w:hAnsi="Times New Roman" w:cs="Times New Roman"/>
+          <w:sz w:val="24"/>
+          <w:szCs w:val="24"/>
+        </w:rPr>
+        <w:t>OpenAI</w:t>
+      </w:r>
+      <w:proofErr w:type="spellEnd"/>
+      <w:r>
+        <w:rPr>
+          <w:rFonts w:ascii="Times New Roman" w:eastAsia="Times New Roman" w:hAnsi="Times New Roman" w:cs="Times New Roman"/>
+          <w:sz w:val="24"/>
+          <w:szCs w:val="24"/>
+        </w:rPr>
+        <w:t xml:space="preserve">-Codex, </w:t>
+      </w:r>
+      <w:proofErr w:type="spellStart"/>
+      <w:r>
+        <w:rPr>
+          <w:rFonts w:ascii="Times New Roman" w:eastAsia="Times New Roman" w:hAnsi="Times New Roman" w:cs="Times New Roman"/>
+          <w:sz w:val="24"/>
+          <w:szCs w:val="24"/>
+        </w:rPr>
+        <w:t>OpenCode</w:t>
+      </w:r>
+      <w:proofErr w:type="spellEnd"/>
+      <w:r>
+        <w:rPr>
+          <w:rFonts w:ascii="Times New Roman" w:eastAsia="Times New Roman" w:hAnsi="Times New Roman" w:cs="Times New Roman"/>
+          <w:sz w:val="24"/>
+          <w:szCs w:val="24"/>
+        </w:rPr>
+        <w:t xml:space="preserve">, </w:t>
+      </w:r>
+      <w:proofErr w:type="spellStart"/>
+      <w:r>
+        <w:rPr>
+          <w:rFonts w:ascii="Times New Roman" w:eastAsia="Times New Roman" w:hAnsi="Times New Roman" w:cs="Times New Roman"/>
+          <w:sz w:val="24"/>
+          <w:szCs w:val="24"/>
+        </w:rPr>
+        <w:t>KiloCode</w:t>
+      </w:r>
+      <w:proofErr w:type="spellEnd"/>
+      <w:r>
+        <w:rPr>
+          <w:rFonts w:ascii="Times New Roman" w:eastAsia="Times New Roman" w:hAnsi="Times New Roman" w:cs="Times New Roman"/>
+          <w:sz w:val="24"/>
+          <w:szCs w:val="24"/>
+        </w:rPr>
+        <w:t xml:space="preserve">, </w:t>
+      </w:r>
+      <w:proofErr w:type="spellStart"/>
+      <w:r>
+        <w:rPr>
+          <w:rFonts w:ascii="Times New Roman" w:eastAsia="Times New Roman" w:hAnsi="Times New Roman" w:cs="Times New Roman"/>
+          <w:sz w:val="24"/>
+          <w:szCs w:val="24"/>
+        </w:rPr>
+        <w:t>Github</w:t>
+      </w:r>
+      <w:proofErr w:type="spellEnd"/>
+      <w:r>
+        <w:rPr>
+          <w:rFonts w:ascii="Times New Roman" w:eastAsia="Times New Roman" w:hAnsi="Times New Roman" w:cs="Times New Roman"/>
+          <w:sz w:val="24"/>
+          <w:szCs w:val="24"/>
+        </w:rPr>
+        <w:t xml:space="preserve">-Copilot </w:t>
+      </w:r>
+    </w:p>
+    <w:p>
+      <w:pPr>
+        <w:numPr>
+          <w:ilvl w:val="0"/>
+          <w:numId w:val="1"/>
+        </w:numPr>
+        <w:spacing w:before="100" w:beforeAutospacing="1" w:after="100" w:afterAutospacing="1" w:line="240" w:lineRule="auto"/>
+        <w:rPr>
+          <w:rFonts w:ascii="Times New Roman" w:eastAsia="Times New Roman" w:hAnsi="Times New Roman" w:cs="Times New Roman"/>
+          <w:sz w:val="24"/>
+          <w:szCs w:val="24"/>
+        </w:rPr>
+      </w:pPr>
+      <w:r>
+        <w:rPr>
+          <w:rFonts w:ascii="Times New Roman" w:eastAsia="Times New Roman" w:hAnsi="Times New Roman" w:cs="Times New Roman"/>
+          <w:b/>
+          <w:bCs/>
+          <w:sz w:val="24"/>
+          <w:szCs w:val="24"/>
+        </w:rPr>
+        <w:t xml:space="preserve">AI </w:t>
+      </w:r>
+      <w:proofErr w:type="spellStart"/>
+      <w:r>
+        <w:rPr>
+          <w:rFonts w:ascii="Times New Roman" w:eastAsia="Times New Roman" w:hAnsi="Times New Roman" w:cs="Times New Roman"/>
+          <w:b/>
+          <w:bCs/>
+          <w:sz w:val="24"/>
+          <w:szCs w:val="24"/>
+        </w:rPr>
+        <w:t>Chatbot</w:t>
+      </w:r>
+      <w:proofErr w:type="spellEnd"/>
+      <w:r>
+        <w:rPr>
+          <w:rFonts w:ascii="Times New Roman" w:eastAsia="Times New Roman" w:hAnsi="Times New Roman" w:cs="Times New Roman"/>
+          <w:b/>
+          <w:bCs/>
+          <w:sz w:val="24"/>
+          <w:szCs w:val="24"/>
+        </w:rPr>
+        <w:t xml:space="preserve"> tools: </w:t>
+      </w:r>
+      <w:proofErr w:type="spellStart"/>
+      <w:r>
+        <w:rPr>
+          <w:rFonts w:ascii="Times New Roman" w:eastAsia="Times New Roman" w:hAnsi="Times New Roman" w:cs="Times New Roman"/>
+          <w:b/>
+          <w:bCs/>
+          <w:sz w:val="24"/>
+          <w:szCs w:val="24"/>
+        </w:rPr>
+        <w:t>Github</w:t>
+      </w:r>
+      <w:proofErr w:type="spellEnd"/>
+      <w:r>
+        <w:rPr>
+          <w:rFonts w:ascii="Times New Roman" w:eastAsia="Times New Roman" w:hAnsi="Times New Roman" w:cs="Times New Roman"/>
+          <w:b/>
+          <w:bCs/>
+          <w:sz w:val="24"/>
+          <w:szCs w:val="24"/>
+        </w:rPr>
+        <w:t xml:space="preserve"> inline chat, </w:t>
+      </w:r>
+      <w:proofErr w:type="spellStart"/>
+      <w:r>
+        <w:rPr>
+          <w:rFonts w:ascii="Times New Roman" w:eastAsia="Times New Roman" w:hAnsi="Times New Roman" w:cs="Times New Roman"/>
+          <w:b/>
+          <w:bCs/>
+          <w:sz w:val="24"/>
+          <w:szCs w:val="24"/>
+        </w:rPr>
+        <w:t>OpenAI-ChatGPT</w:t>
+      </w:r>
+      <w:proofErr w:type="spellEnd"/>
+      <w:r>
+        <w:rPr>
+          <w:rFonts w:ascii="Times New Roman" w:eastAsia="Times New Roman" w:hAnsi="Times New Roman" w:cs="Times New Roman"/>
+          <w:b/>
+          <w:bCs/>
+          <w:sz w:val="24"/>
+          <w:szCs w:val="24"/>
+        </w:rPr>
+        <w:t xml:space="preserve">, Gemini, Claude, </w:t>
+      </w:r>
+      <w:proofErr w:type="spellStart"/>
+      <w:r>
+        <w:rPr>
+          <w:rFonts w:ascii="Times New Roman" w:eastAsia="Times New Roman" w:hAnsi="Times New Roman" w:cs="Times New Roman"/>
+          <w:b/>
+          <w:bCs/>
+          <w:sz w:val="24"/>
+          <w:szCs w:val="24"/>
+        </w:rPr>
+        <w:t>Grok</w:t>
+      </w:r>
+      <w:proofErr w:type="spellEnd"/>
+      <w:r>
+        <w:rPr>
+          <w:rFonts w:ascii="Times New Roman" w:eastAsia="Times New Roman" w:hAnsi="Times New Roman" w:cs="Times New Roman"/>
+          <w:b/>
+          <w:bCs/>
+          <w:sz w:val="24"/>
+          <w:szCs w:val="24"/>
+        </w:rPr>
+        <w:t>, Perplexity &amp; Comet browser and Meta AI</w:t>
       </w:r>
     </w:p>
     <w:p>
@@ -739,7 +1184,17 @@
           <w:sz w:val="24"/>
           <w:szCs w:val="24"/>
         </w:rPr>
-        <w:t>Business Development Executive &amp; Web Portal Manager</w:t>
+        <w:t xml:space="preserve">Business Development Executive &amp; </w:t>
+      </w:r>
+      <w:r>
+        <w:rPr>
+          <w:rFonts w:ascii="Times New Roman" w:eastAsia="Times New Roman" w:hAnsi="Times New Roman" w:cs="Times New Roman"/>
+          <w:b/>
+          <w:bCs/>
+          <w:sz w:val="24"/>
+          <w:szCs w:val="24"/>
+        </w:rPr>
+        <w:t>Software Developer</w:t>
       </w:r>
     </w:p>
     <w:p>
@@ -785,6 +1240,24 @@
         </w:rPr>
         <w:t xml:space="preserve">Developed and maintain a </w:t>
       </w:r>
+      <w:proofErr w:type="spellStart"/>
+      <w:r>
+        <w:rPr>
+          <w:rFonts w:ascii="Times New Roman" w:eastAsia="Times New Roman" w:hAnsi="Times New Roman" w:cs="Times New Roman"/>
+          <w:sz w:val="24"/>
+          <w:szCs w:val="24"/>
+        </w:rPr>
+        <w:t>Nonsuch</w:t>
+      </w:r>
+      <w:proofErr w:type="spellEnd"/>
+      <w:r>
+        <w:rPr>
+          <w:rFonts w:ascii="Times New Roman" w:eastAsia="Times New Roman" w:hAnsi="Times New Roman" w:cs="Times New Roman"/>
+          <w:sz w:val="24"/>
+          <w:szCs w:val="24"/>
+        </w:rPr>
+        <w:t xml:space="preserve"> ERP </w:t>
+      </w:r>
       <w:r>
         <w:rPr>
           <w:rFonts w:ascii="Times New Roman" w:eastAsia="Times New Roman" w:hAnsi="Times New Roman" w:cs="Times New Roman"/>
@@ -902,7 +1375,6 @@
           <w:sz w:val="24"/>
           <w:szCs w:val="24"/>
         </w:rPr>
-        <w:lastRenderedPageBreak/>
         <w:t xml:space="preserve">Taught </w:t>
       </w:r>
       <w:r>
@@ -936,14 +1408,6 @@
           <w:szCs w:val="24"/>
         </w:rPr>
         <w:t>, and GitHub</w:t>
-      </w:r>
-      <w:r>
-        <w:rPr>
-          <w:rFonts w:ascii="Times New Roman" w:eastAsia="Times New Roman" w:hAnsi="Times New Roman" w:cs="Times New Roman"/>
-          <w:sz w:val="24"/>
-          <w:szCs w:val="24"/>
-        </w:rPr>
-        <w:t xml:space="preserve"> to students.</w:t>
       </w:r>
     </w:p>
     <w:p>
@@ -989,6 +1453,7 @@
           <w:sz w:val="27"/>
           <w:szCs w:val="27"/>
         </w:rPr>
+        <w:lastRenderedPageBreak/>
         <w:t>Maayoit</w:t>
       </w:r>
       <w:proofErr w:type="spellEnd"/>
@@ -1118,26 +1583,6 @@
     </w:p>
     <w:p>
       <w:pPr>
-        <w:spacing w:after="0" w:line="240" w:lineRule="auto"/>
-        <w:rPr>
-          <w:rFonts w:ascii="Times New Roman" w:eastAsia="Times New Roman" w:hAnsi="Times New Roman" w:cs="Times New Roman"/>
-          <w:sz w:val="24"/>
-          <w:szCs w:val="24"/>
-        </w:rPr>
-      </w:pPr>
-      <w:r>
-        <w:rPr>
-          <w:rFonts w:ascii="Times New Roman" w:eastAsia="Times New Roman" w:hAnsi="Times New Roman" w:cs="Times New Roman"/>
-          <w:sz w:val="24"/>
-          <w:szCs w:val="24"/>
-        </w:rPr>
-        <w:pict>
-          <v:rect id="_x0000_i1027" style="width:0;height:1.5pt" o:hralign="center" o:hrstd="t" o:hr="t" fillcolor="#a0a0a0" stroked="f"/>
-        </w:pict>
-      </w:r>
-    </w:p>
-    <w:p>
-      <w:pPr>
         <w:spacing w:before="100" w:beforeAutospacing="1" w:after="100" w:afterAutospacing="1" w:line="240" w:lineRule="auto"/>
         <w:outlineLvl w:val="1"/>
         <w:rPr>
@@ -1301,7 +1746,7 @@
           <w:sz w:val="24"/>
           <w:szCs w:val="24"/>
         </w:rPr>
-        <w:t xml:space="preserve">Technologies: PHP, </w:t>
+        <w:t xml:space="preserve">Technologies: </w:t>
       </w:r>
       <w:proofErr w:type="spellStart"/>
       <w:r>
@@ -1310,7 +1755,7 @@
           <w:sz w:val="24"/>
           <w:szCs w:val="24"/>
         </w:rPr>
-        <w:t>MySQLi</w:t>
+        <w:t>Laravel</w:t>
       </w:r>
       <w:proofErr w:type="spellEnd"/>
       <w:r>
@@ -1319,7 +1764,39 @@
           <w:sz w:val="24"/>
           <w:szCs w:val="24"/>
         </w:rPr>
-        <w:t xml:space="preserve">, Bootstrap, </w:t>
+        <w:t>, Blade engine</w:t>
+      </w:r>
+      <w:r>
+        <w:rPr>
+          <w:rFonts w:ascii="Times New Roman" w:eastAsia="Times New Roman" w:hAnsi="Times New Roman" w:cs="Times New Roman"/>
+          <w:sz w:val="24"/>
+          <w:szCs w:val="24"/>
+        </w:rPr>
+        <w:t xml:space="preserve">, </w:t>
+      </w:r>
+      <w:r>
+        <w:rPr>
+          <w:rFonts w:ascii="Times New Roman" w:eastAsia="Times New Roman" w:hAnsi="Times New Roman" w:cs="Times New Roman"/>
+          <w:sz w:val="24"/>
+          <w:szCs w:val="24"/>
+        </w:rPr>
+        <w:t>MySQL</w:t>
+      </w:r>
+      <w:r>
+        <w:rPr>
+          <w:rFonts w:ascii="Times New Roman" w:eastAsia="Times New Roman" w:hAnsi="Times New Roman" w:cs="Times New Roman"/>
+          <w:sz w:val="24"/>
+          <w:szCs w:val="24"/>
+        </w:rPr>
+        <w:t>, Bootstrap,</w:t>
+      </w:r>
+      <w:r>
+        <w:rPr>
+          <w:rFonts w:ascii="Times New Roman" w:eastAsia="Times New Roman" w:hAnsi="Times New Roman" w:cs="Times New Roman"/>
+          <w:sz w:val="24"/>
+          <w:szCs w:val="24"/>
+        </w:rPr>
+        <w:t xml:space="preserve"> </w:t>
       </w:r>
       <w:proofErr w:type="spellStart"/>
       <w:r>
@@ -1328,7 +1805,7 @@
           <w:sz w:val="24"/>
           <w:szCs w:val="24"/>
         </w:rPr>
-        <w:t>DomPDF</w:t>
+        <w:t>TailwindCss</w:t>
       </w:r>
       <w:proofErr w:type="spellEnd"/>
       <w:r>
@@ -1392,7 +1869,15 @@
           <w:sz w:val="24"/>
           <w:szCs w:val="24"/>
         </w:rPr>
-        <w:t>Features: Product management (CRUD), cart system, WhatsApp integration, admin dashboard, and hero slider.</w:t>
+        <w:t>Features: Product management (CRUD), cart system, WhatsAp</w:t>
+      </w:r>
+      <w:r>
+        <w:rPr>
+          <w:rFonts w:ascii="Times New Roman" w:eastAsia="Times New Roman" w:hAnsi="Times New Roman" w:cs="Times New Roman"/>
+          <w:sz w:val="24"/>
+          <w:szCs w:val="24"/>
+        </w:rPr>
+        <w:t>p integration, admin dashboard, SEO capturing south-west Nigeria</w:t>
       </w:r>
     </w:p>
     <w:p>
@@ -1414,7 +1899,67 @@
           <w:sz w:val="24"/>
           <w:szCs w:val="24"/>
         </w:rPr>
-        <w:t>Technologies: HTML, CSS, Bootstrap, JavaScript, PHP, MySQL.</w:t>
+        <w:t xml:space="preserve">Technologies: </w:t>
+      </w:r>
+      <w:proofErr w:type="spellStart"/>
+      <w:r>
+        <w:rPr>
+          <w:rFonts w:ascii="Times New Roman" w:eastAsia="Times New Roman" w:hAnsi="Times New Roman" w:cs="Times New Roman"/>
+          <w:sz w:val="24"/>
+          <w:szCs w:val="24"/>
+        </w:rPr>
+        <w:t>Laravel</w:t>
+      </w:r>
+      <w:proofErr w:type="spellEnd"/>
+      <w:r>
+        <w:rPr>
+          <w:rFonts w:ascii="Times New Roman" w:eastAsia="Times New Roman" w:hAnsi="Times New Roman" w:cs="Times New Roman"/>
+          <w:sz w:val="24"/>
+          <w:szCs w:val="24"/>
+        </w:rPr>
+        <w:t xml:space="preserve">, </w:t>
+      </w:r>
+      <w:r>
+        <w:rPr>
+          <w:rFonts w:ascii="Times New Roman" w:eastAsia="Times New Roman" w:hAnsi="Times New Roman" w:cs="Times New Roman"/>
+          <w:sz w:val="24"/>
+          <w:szCs w:val="24"/>
+        </w:rPr>
+        <w:t xml:space="preserve">API, </w:t>
+      </w:r>
+      <w:proofErr w:type="spellStart"/>
+      <w:r>
+        <w:rPr>
+          <w:rFonts w:ascii="Times New Roman" w:eastAsia="Times New Roman" w:hAnsi="Times New Roman" w:cs="Times New Roman"/>
+          <w:sz w:val="24"/>
+          <w:szCs w:val="24"/>
+        </w:rPr>
+        <w:t>Reactjs</w:t>
+      </w:r>
+      <w:proofErr w:type="spellEnd"/>
+      <w:r>
+        <w:rPr>
+          <w:rFonts w:ascii="Times New Roman" w:eastAsia="Times New Roman" w:hAnsi="Times New Roman" w:cs="Times New Roman"/>
+          <w:sz w:val="24"/>
+          <w:szCs w:val="24"/>
+        </w:rPr>
+        <w:t>/inertia,</w:t>
+      </w:r>
+      <w:r>
+        <w:rPr>
+          <w:rFonts w:ascii="Times New Roman" w:eastAsia="Times New Roman" w:hAnsi="Times New Roman" w:cs="Times New Roman"/>
+          <w:sz w:val="24"/>
+          <w:szCs w:val="24"/>
+        </w:rPr>
+        <w:t xml:space="preserve"> </w:t>
+      </w:r>
+      <w:r>
+        <w:rPr>
+          <w:rFonts w:ascii="Times New Roman" w:eastAsia="Times New Roman" w:hAnsi="Times New Roman" w:cs="Times New Roman"/>
+          <w:sz w:val="24"/>
+          <w:szCs w:val="24"/>
+        </w:rPr>
+        <w:t>HTML, CSS, Bootstrap, JavaScript.</w:t>
       </w:r>
     </w:p>
     <w:p>
@@ -1447,7 +1992,27 @@
           <w:sz w:val="27"/>
           <w:szCs w:val="27"/>
         </w:rPr>
-        <w:t xml:space="preserve"> School Management System</w:t>
+        <w:t xml:space="preserve"> </w:t>
+      </w:r>
+      <w:r>
+        <w:rPr>
+          <w:rFonts w:ascii="Times New Roman" w:eastAsia="Times New Roman" w:hAnsi="Times New Roman" w:cs="Times New Roman"/>
+          <w:b/>
+          <w:bCs/>
+          <w:sz w:val="27"/>
+          <w:szCs w:val="27"/>
+        </w:rPr>
+        <w:t>Retirees</w:t>
+      </w:r>
+      <w:r>
+        <w:rPr>
+          <w:rFonts w:ascii="Times New Roman" w:eastAsia="Times New Roman" w:hAnsi="Times New Roman" w:cs="Times New Roman"/>
+          <w:b/>
+          <w:bCs/>
+          <w:sz w:val="27"/>
+          <w:szCs w:val="27"/>
+        </w:rPr>
+        <w:t xml:space="preserve"> Management System</w:t>
       </w:r>
     </w:p>
     <w:p>
@@ -1469,25 +2034,41 @@
           <w:sz w:val="24"/>
           <w:szCs w:val="24"/>
         </w:rPr>
-        <w:t xml:space="preserve">Features: Multi-step student registration, admin approval, </w:t>
-      </w:r>
-      <w:r>
-        <w:rPr>
-          <w:rFonts w:ascii="Times New Roman" w:eastAsia="Times New Roman" w:hAnsi="Times New Roman" w:cs="Times New Roman"/>
-          <w:b/>
-          <w:bCs/>
-          <w:sz w:val="24"/>
-          <w:szCs w:val="24"/>
-        </w:rPr>
-        <w:t>unique ID login</w:t>
-      </w:r>
-      <w:r>
-        <w:rPr>
-          <w:rFonts w:ascii="Times New Roman" w:eastAsia="Times New Roman" w:hAnsi="Times New Roman" w:cs="Times New Roman"/>
-          <w:sz w:val="24"/>
-          <w:szCs w:val="24"/>
-        </w:rPr>
-        <w:t>, PDF generation, teacher dashboards, CA/exam recording, student result portal, and role-based access control.</w:t>
+        <w:t>Built for</w:t>
+      </w:r>
+      <w:r>
+        <w:rPr>
+          <w:rFonts w:ascii="Times New Roman" w:eastAsia="Times New Roman" w:hAnsi="Times New Roman" w:cs="Times New Roman"/>
+          <w:sz w:val="24"/>
+          <w:szCs w:val="24"/>
+        </w:rPr>
+        <w:t xml:space="preserve"> </w:t>
+      </w:r>
+      <w:proofErr w:type="spellStart"/>
+      <w:r>
+        <w:rPr>
+          <w:rFonts w:ascii="Times New Roman" w:eastAsia="Times New Roman" w:hAnsi="Times New Roman" w:cs="Times New Roman"/>
+          <w:sz w:val="24"/>
+          <w:szCs w:val="24"/>
+        </w:rPr>
+        <w:t>Retiress</w:t>
+      </w:r>
+      <w:proofErr w:type="spellEnd"/>
+      <w:r>
+        <w:rPr>
+          <w:rFonts w:ascii="Times New Roman" w:eastAsia="Times New Roman" w:hAnsi="Times New Roman" w:cs="Times New Roman"/>
+          <w:sz w:val="24"/>
+          <w:szCs w:val="24"/>
+        </w:rPr>
+        <w:t xml:space="preserve"> verification system</w:t>
+      </w:r>
+      <w:r>
+        <w:rPr>
+          <w:rFonts w:ascii="Times New Roman" w:eastAsia="Times New Roman" w:hAnsi="Times New Roman" w:cs="Times New Roman"/>
+          <w:sz w:val="24"/>
+          <w:szCs w:val="24"/>
+        </w:rPr>
+        <w:t>.</w:t>
       </w:r>
     </w:p>
     <w:p>
@@ -1509,6 +2090,372 @@
           <w:sz w:val="24"/>
           <w:szCs w:val="24"/>
         </w:rPr>
+        <w:t xml:space="preserve">Features: Retirees registration with ID, login with an ID, capture facial, thumb print and palm scan and a confirmation email. </w:t>
+      </w:r>
+    </w:p>
+    <w:p>
+      <w:pPr>
+        <w:numPr>
+          <w:ilvl w:val="0"/>
+          <w:numId w:val="8"/>
+        </w:numPr>
+        <w:spacing w:before="100" w:beforeAutospacing="1" w:after="100" w:afterAutospacing="1" w:line="240" w:lineRule="auto"/>
+        <w:rPr>
+          <w:rFonts w:ascii="Times New Roman" w:eastAsia="Times New Roman" w:hAnsi="Times New Roman" w:cs="Times New Roman"/>
+          <w:sz w:val="24"/>
+          <w:szCs w:val="24"/>
+        </w:rPr>
+      </w:pPr>
+      <w:r>
+        <w:rPr>
+          <w:rFonts w:ascii="Times New Roman" w:eastAsia="Times New Roman" w:hAnsi="Times New Roman" w:cs="Times New Roman"/>
+          <w:sz w:val="24"/>
+          <w:szCs w:val="24"/>
+        </w:rPr>
+        <w:t xml:space="preserve">Technologies: </w:t>
+      </w:r>
+      <w:proofErr w:type="spellStart"/>
+      <w:r>
+        <w:rPr>
+          <w:rFonts w:ascii="Times New Roman" w:eastAsia="Times New Roman" w:hAnsi="Times New Roman" w:cs="Times New Roman"/>
+          <w:sz w:val="24"/>
+          <w:szCs w:val="24"/>
+        </w:rPr>
+        <w:t>Laravel</w:t>
+      </w:r>
+      <w:proofErr w:type="spellEnd"/>
+      <w:r>
+        <w:rPr>
+          <w:rFonts w:ascii="Times New Roman" w:eastAsia="Times New Roman" w:hAnsi="Times New Roman" w:cs="Times New Roman"/>
+          <w:sz w:val="24"/>
+          <w:szCs w:val="24"/>
+        </w:rPr>
+        <w:t xml:space="preserve">, </w:t>
+      </w:r>
+      <w:proofErr w:type="spellStart"/>
+      <w:r>
+        <w:rPr>
+          <w:rFonts w:ascii="Times New Roman" w:eastAsia="Times New Roman" w:hAnsi="Times New Roman" w:cs="Times New Roman"/>
+          <w:sz w:val="24"/>
+          <w:szCs w:val="24"/>
+        </w:rPr>
+        <w:t>Reactjs</w:t>
+      </w:r>
+      <w:proofErr w:type="spellEnd"/>
+      <w:r>
+        <w:rPr>
+          <w:rFonts w:ascii="Times New Roman" w:eastAsia="Times New Roman" w:hAnsi="Times New Roman" w:cs="Times New Roman"/>
+          <w:sz w:val="24"/>
+          <w:szCs w:val="24"/>
+        </w:rPr>
+        <w:t xml:space="preserve">, Bootstrap, </w:t>
+      </w:r>
+      <w:proofErr w:type="spellStart"/>
+      <w:r>
+        <w:rPr>
+          <w:rFonts w:ascii="Times New Roman" w:eastAsia="Times New Roman" w:hAnsi="Times New Roman" w:cs="Times New Roman"/>
+          <w:sz w:val="24"/>
+          <w:szCs w:val="24"/>
+        </w:rPr>
+        <w:t>tailwindcss</w:t>
+      </w:r>
+      <w:proofErr w:type="spellEnd"/>
+    </w:p>
+    <w:p>
+      <w:pPr>
+        <w:spacing w:before="100" w:beforeAutospacing="1" w:after="100" w:afterAutospacing="1" w:line="240" w:lineRule="auto"/>
+        <w:outlineLvl w:val="2"/>
+        <w:rPr>
+          <w:rFonts w:ascii="Times New Roman" w:eastAsia="Times New Roman" w:hAnsi="Times New Roman" w:cs="Times New Roman"/>
+          <w:b/>
+          <w:bCs/>
+          <w:sz w:val="27"/>
+          <w:szCs w:val="27"/>
+        </w:rPr>
+      </w:pPr>
+      <w:r>
+        <w:rPr>
+          <w:rFonts w:ascii="Times New Roman" w:eastAsia="Times New Roman" w:hAnsi="Times New Roman" w:cs="Times New Roman"/>
+          <w:b/>
+          <w:bCs/>
+          <w:sz w:val="27"/>
+          <w:szCs w:val="27"/>
+        </w:rPr>
+        <w:t>Artisan</w:t>
+      </w:r>
+      <w:r>
+        <w:rPr>
+          <w:rFonts w:ascii="Times New Roman" w:eastAsia="Times New Roman" w:hAnsi="Times New Roman" w:cs="Times New Roman"/>
+          <w:b/>
+          <w:bCs/>
+          <w:sz w:val="27"/>
+          <w:szCs w:val="27"/>
+        </w:rPr>
+        <w:t xml:space="preserve"> Management System</w:t>
+      </w:r>
+    </w:p>
+    <w:p>
+      <w:pPr>
+        <w:numPr>
+          <w:ilvl w:val="0"/>
+          <w:numId w:val="8"/>
+        </w:numPr>
+        <w:spacing w:before="100" w:beforeAutospacing="1" w:after="100" w:afterAutospacing="1" w:line="240" w:lineRule="auto"/>
+        <w:rPr>
+          <w:rFonts w:ascii="Times New Roman" w:eastAsia="Times New Roman" w:hAnsi="Times New Roman" w:cs="Times New Roman"/>
+          <w:sz w:val="24"/>
+          <w:szCs w:val="24"/>
+        </w:rPr>
+      </w:pPr>
+      <w:r>
+        <w:rPr>
+          <w:rFonts w:ascii="Times New Roman" w:eastAsia="Times New Roman" w:hAnsi="Times New Roman" w:cs="Times New Roman"/>
+          <w:sz w:val="24"/>
+          <w:szCs w:val="24"/>
+        </w:rPr>
+        <w:t>Built for</w:t>
+      </w:r>
+      <w:r>
+        <w:rPr>
+          <w:rFonts w:ascii="Times New Roman" w:eastAsia="Times New Roman" w:hAnsi="Times New Roman" w:cs="Times New Roman"/>
+          <w:sz w:val="24"/>
+          <w:szCs w:val="24"/>
+        </w:rPr>
+        <w:t xml:space="preserve"> </w:t>
+      </w:r>
+      <w:r>
+        <w:rPr>
+          <w:rFonts w:ascii="Times New Roman" w:eastAsia="Times New Roman" w:hAnsi="Times New Roman" w:cs="Times New Roman"/>
+          <w:sz w:val="24"/>
+          <w:szCs w:val="24"/>
+        </w:rPr>
+        <w:t>Artisan</w:t>
+      </w:r>
+      <w:r>
+        <w:rPr>
+          <w:rFonts w:ascii="Times New Roman" w:eastAsia="Times New Roman" w:hAnsi="Times New Roman" w:cs="Times New Roman"/>
+          <w:sz w:val="24"/>
+          <w:szCs w:val="24"/>
+        </w:rPr>
+        <w:t xml:space="preserve"> </w:t>
+      </w:r>
+      <w:r>
+        <w:rPr>
+          <w:rFonts w:ascii="Times New Roman" w:eastAsia="Times New Roman" w:hAnsi="Times New Roman" w:cs="Times New Roman"/>
+          <w:sz w:val="24"/>
+          <w:szCs w:val="24"/>
+        </w:rPr>
+        <w:t>management system</w:t>
+      </w:r>
+      <w:r>
+        <w:rPr>
+          <w:rFonts w:ascii="Times New Roman" w:eastAsia="Times New Roman" w:hAnsi="Times New Roman" w:cs="Times New Roman"/>
+          <w:sz w:val="24"/>
+          <w:szCs w:val="24"/>
+        </w:rPr>
+        <w:t>.</w:t>
+      </w:r>
+    </w:p>
+    <w:p>
+      <w:pPr>
+        <w:numPr>
+          <w:ilvl w:val="0"/>
+          <w:numId w:val="8"/>
+        </w:numPr>
+        <w:spacing w:before="100" w:beforeAutospacing="1" w:after="100" w:afterAutospacing="1" w:line="240" w:lineRule="auto"/>
+        <w:rPr>
+          <w:rFonts w:ascii="Times New Roman" w:eastAsia="Times New Roman" w:hAnsi="Times New Roman" w:cs="Times New Roman"/>
+          <w:sz w:val="24"/>
+          <w:szCs w:val="24"/>
+        </w:rPr>
+      </w:pPr>
+      <w:r>
+        <w:rPr>
+          <w:rFonts w:ascii="Times New Roman" w:eastAsia="Times New Roman" w:hAnsi="Times New Roman" w:cs="Times New Roman"/>
+          <w:sz w:val="24"/>
+          <w:szCs w:val="24"/>
+        </w:rPr>
+        <w:t xml:space="preserve">Features: </w:t>
+      </w:r>
+      <w:r>
+        <w:rPr>
+          <w:rFonts w:ascii="Times New Roman" w:eastAsia="Times New Roman" w:hAnsi="Times New Roman" w:cs="Times New Roman"/>
+          <w:sz w:val="24"/>
+          <w:szCs w:val="24"/>
+        </w:rPr>
+        <w:t xml:space="preserve">Artisans registration, customers registration with National Identity which is subject to approval of the Admin. Each with their dashboards </w:t>
+      </w:r>
+    </w:p>
+    <w:p>
+      <w:pPr>
+        <w:numPr>
+          <w:ilvl w:val="0"/>
+          <w:numId w:val="8"/>
+        </w:numPr>
+        <w:spacing w:before="100" w:beforeAutospacing="1" w:after="100" w:afterAutospacing="1" w:line="240" w:lineRule="auto"/>
+        <w:rPr>
+          <w:rFonts w:ascii="Times New Roman" w:eastAsia="Times New Roman" w:hAnsi="Times New Roman" w:cs="Times New Roman"/>
+          <w:sz w:val="24"/>
+          <w:szCs w:val="24"/>
+        </w:rPr>
+      </w:pPr>
+      <w:r>
+        <w:rPr>
+          <w:rFonts w:ascii="Times New Roman" w:eastAsia="Times New Roman" w:hAnsi="Times New Roman" w:cs="Times New Roman"/>
+          <w:sz w:val="24"/>
+          <w:szCs w:val="24"/>
+        </w:rPr>
+        <w:t xml:space="preserve">Technologies: </w:t>
+      </w:r>
+      <w:proofErr w:type="spellStart"/>
+      <w:r>
+        <w:rPr>
+          <w:rFonts w:ascii="Times New Roman" w:eastAsia="Times New Roman" w:hAnsi="Times New Roman" w:cs="Times New Roman"/>
+          <w:sz w:val="24"/>
+          <w:szCs w:val="24"/>
+        </w:rPr>
+        <w:t>Laravel</w:t>
+      </w:r>
+      <w:proofErr w:type="spellEnd"/>
+      <w:r>
+        <w:rPr>
+          <w:rFonts w:ascii="Times New Roman" w:eastAsia="Times New Roman" w:hAnsi="Times New Roman" w:cs="Times New Roman"/>
+          <w:sz w:val="24"/>
+          <w:szCs w:val="24"/>
+        </w:rPr>
+        <w:t xml:space="preserve">, </w:t>
+      </w:r>
+      <w:proofErr w:type="spellStart"/>
+      <w:r>
+        <w:rPr>
+          <w:rFonts w:ascii="Times New Roman" w:eastAsia="Times New Roman" w:hAnsi="Times New Roman" w:cs="Times New Roman"/>
+          <w:sz w:val="24"/>
+          <w:szCs w:val="24"/>
+        </w:rPr>
+        <w:t>Reactjs</w:t>
+      </w:r>
+      <w:proofErr w:type="spellEnd"/>
+      <w:r>
+        <w:rPr>
+          <w:rFonts w:ascii="Times New Roman" w:eastAsia="Times New Roman" w:hAnsi="Times New Roman" w:cs="Times New Roman"/>
+          <w:sz w:val="24"/>
+          <w:szCs w:val="24"/>
+        </w:rPr>
+        <w:t xml:space="preserve">, Bootstrap, </w:t>
+      </w:r>
+      <w:proofErr w:type="spellStart"/>
+      <w:r>
+        <w:rPr>
+          <w:rFonts w:ascii="Times New Roman" w:eastAsia="Times New Roman" w:hAnsi="Times New Roman" w:cs="Times New Roman"/>
+          <w:sz w:val="24"/>
+          <w:szCs w:val="24"/>
+        </w:rPr>
+        <w:t>tailwindcss</w:t>
+      </w:r>
+      <w:proofErr w:type="spellEnd"/>
+    </w:p>
+    <w:p>
+      <w:pPr>
+        <w:spacing w:before="100" w:beforeAutospacing="1" w:after="100" w:afterAutospacing="1" w:line="240" w:lineRule="auto"/>
+        <w:rPr>
+          <w:rFonts w:ascii="Times New Roman" w:eastAsia="Times New Roman" w:hAnsi="Times New Roman" w:cs="Times New Roman"/>
+          <w:sz w:val="24"/>
+          <w:szCs w:val="24"/>
+        </w:rPr>
+      </w:pPr>
+    </w:p>
+    <w:p>
+      <w:pPr>
+        <w:spacing w:before="100" w:beforeAutospacing="1" w:after="100" w:afterAutospacing="1" w:line="240" w:lineRule="auto"/>
+        <w:outlineLvl w:val="2"/>
+        <w:rPr>
+          <w:rFonts w:ascii="Times New Roman" w:eastAsia="Times New Roman" w:hAnsi="Times New Roman" w:cs="Times New Roman"/>
+          <w:b/>
+          <w:bCs/>
+          <w:sz w:val="27"/>
+          <w:szCs w:val="27"/>
+        </w:rPr>
+      </w:pPr>
+      <w:r>
+        <w:rPr>
+          <w:rFonts w:ascii="Segoe UI Symbol" w:eastAsia="Times New Roman" w:hAnsi="Segoe UI Symbol" w:cs="Segoe UI Symbol"/>
+          <w:b/>
+          <w:bCs/>
+          <w:sz w:val="27"/>
+          <w:szCs w:val="27"/>
+        </w:rPr>
+        <w:t>🔹</w:t>
+      </w:r>
+      <w:r>
+        <w:rPr>
+          <w:rFonts w:ascii="Times New Roman" w:eastAsia="Times New Roman" w:hAnsi="Times New Roman" w:cs="Times New Roman"/>
+          <w:b/>
+          <w:bCs/>
+          <w:sz w:val="27"/>
+          <w:szCs w:val="27"/>
+        </w:rPr>
+        <w:t xml:space="preserve"> School Management System</w:t>
+      </w:r>
+    </w:p>
+    <w:p>
+      <w:pPr>
+        <w:numPr>
+          <w:ilvl w:val="0"/>
+          <w:numId w:val="8"/>
+        </w:numPr>
+        <w:spacing w:before="100" w:beforeAutospacing="1" w:after="100" w:afterAutospacing="1" w:line="240" w:lineRule="auto"/>
+        <w:rPr>
+          <w:rFonts w:ascii="Times New Roman" w:eastAsia="Times New Roman" w:hAnsi="Times New Roman" w:cs="Times New Roman"/>
+          <w:sz w:val="24"/>
+          <w:szCs w:val="24"/>
+        </w:rPr>
+      </w:pPr>
+      <w:r>
+        <w:rPr>
+          <w:rFonts w:ascii="Times New Roman" w:eastAsia="Times New Roman" w:hAnsi="Times New Roman" w:cs="Times New Roman"/>
+          <w:sz w:val="24"/>
+          <w:szCs w:val="24"/>
+        </w:rPr>
+        <w:t xml:space="preserve">Features: Multi-step student registration, admin approval, </w:t>
+      </w:r>
+      <w:r>
+        <w:rPr>
+          <w:rFonts w:ascii="Times New Roman" w:eastAsia="Times New Roman" w:hAnsi="Times New Roman" w:cs="Times New Roman"/>
+          <w:b/>
+          <w:bCs/>
+          <w:sz w:val="24"/>
+          <w:szCs w:val="24"/>
+        </w:rPr>
+        <w:t>unique ID login</w:t>
+      </w:r>
+      <w:r>
+        <w:rPr>
+          <w:rFonts w:ascii="Times New Roman" w:eastAsia="Times New Roman" w:hAnsi="Times New Roman" w:cs="Times New Roman"/>
+          <w:sz w:val="24"/>
+          <w:szCs w:val="24"/>
+        </w:rPr>
+        <w:t>, PDF generation, teacher dashboards, CA/exam recording, student result portal, and role-based access control.</w:t>
+      </w:r>
+    </w:p>
+    <w:p>
+      <w:pPr>
+        <w:numPr>
+          <w:ilvl w:val="0"/>
+          <w:numId w:val="8"/>
+        </w:numPr>
+        <w:spacing w:before="100" w:beforeAutospacing="1" w:after="100" w:afterAutospacing="1" w:line="240" w:lineRule="auto"/>
+        <w:rPr>
+          <w:rFonts w:ascii="Times New Roman" w:eastAsia="Times New Roman" w:hAnsi="Times New Roman" w:cs="Times New Roman"/>
+          <w:sz w:val="24"/>
+          <w:szCs w:val="24"/>
+        </w:rPr>
+      </w:pPr>
+      <w:r>
+        <w:rPr>
+          <w:rFonts w:ascii="Times New Roman" w:eastAsia="Times New Roman" w:hAnsi="Times New Roman" w:cs="Times New Roman"/>
+          <w:sz w:val="24"/>
+          <w:szCs w:val="24"/>
+        </w:rPr>
         <w:t>Technologies: PHP (</w:t>
       </w:r>
       <w:proofErr w:type="spellStart"/>
@@ -1518,6 +2465,164 @@
           <w:sz w:val="24"/>
           <w:szCs w:val="24"/>
         </w:rPr>
+        <w:t>MyS</w:t>
+      </w:r>
+      <w:r>
+        <w:rPr>
+          <w:rFonts w:ascii="Times New Roman" w:eastAsia="Times New Roman" w:hAnsi="Times New Roman" w:cs="Times New Roman"/>
+          <w:sz w:val="24"/>
+          <w:szCs w:val="24"/>
+        </w:rPr>
+        <w:t>QLi</w:t>
+      </w:r>
+      <w:proofErr w:type="spellEnd"/>
+      <w:r>
+        <w:rPr>
+          <w:rFonts w:ascii="Times New Roman" w:eastAsia="Times New Roman" w:hAnsi="Times New Roman" w:cs="Times New Roman"/>
+          <w:sz w:val="24"/>
+          <w:szCs w:val="24"/>
+        </w:rPr>
+        <w:t xml:space="preserve">), Bootstrap, jQuery, </w:t>
+      </w:r>
+      <w:proofErr w:type="spellStart"/>
+      <w:r>
+        <w:rPr>
+          <w:rFonts w:ascii="Times New Roman" w:eastAsia="Times New Roman" w:hAnsi="Times New Roman" w:cs="Times New Roman"/>
+          <w:sz w:val="24"/>
+          <w:szCs w:val="24"/>
+        </w:rPr>
+        <w:t>DomPDF</w:t>
+      </w:r>
+      <w:proofErr w:type="spellEnd"/>
+    </w:p>
+    <w:p>
+      <w:pPr>
+        <w:spacing w:before="100" w:beforeAutospacing="1" w:after="100" w:afterAutospacing="1" w:line="240" w:lineRule="auto"/>
+        <w:outlineLvl w:val="2"/>
+        <w:rPr>
+          <w:rFonts w:ascii="Times New Roman" w:eastAsia="Times New Roman" w:hAnsi="Times New Roman" w:cs="Times New Roman"/>
+          <w:b/>
+          <w:bCs/>
+          <w:sz w:val="27"/>
+          <w:szCs w:val="27"/>
+        </w:rPr>
+      </w:pPr>
+      <w:r>
+        <w:rPr>
+          <w:rFonts w:ascii="Segoe UI Symbol" w:eastAsia="Times New Roman" w:hAnsi="Segoe UI Symbol" w:cs="Segoe UI Symbol"/>
+          <w:b/>
+          <w:bCs/>
+          <w:sz w:val="27"/>
+          <w:szCs w:val="27"/>
+        </w:rPr>
+        <w:t>🔹</w:t>
+      </w:r>
+      <w:r>
+        <w:rPr>
+          <w:rFonts w:ascii="Times New Roman" w:eastAsia="Times New Roman" w:hAnsi="Times New Roman" w:cs="Times New Roman"/>
+          <w:b/>
+          <w:bCs/>
+          <w:sz w:val="27"/>
+          <w:szCs w:val="27"/>
+        </w:rPr>
+        <w:t xml:space="preserve"> </w:t>
+      </w:r>
+      <w:r>
+        <w:rPr>
+          <w:rFonts w:ascii="Times New Roman" w:eastAsia="Times New Roman" w:hAnsi="Times New Roman" w:cs="Times New Roman"/>
+          <w:b/>
+          <w:bCs/>
+          <w:sz w:val="27"/>
+          <w:szCs w:val="27"/>
+        </w:rPr>
+        <w:t>Full ERP</w:t>
+      </w:r>
+      <w:r>
+        <w:rPr>
+          <w:rFonts w:ascii="Times New Roman" w:eastAsia="Times New Roman" w:hAnsi="Times New Roman" w:cs="Times New Roman"/>
+          <w:b/>
+          <w:bCs/>
+          <w:sz w:val="27"/>
+          <w:szCs w:val="27"/>
+        </w:rPr>
+        <w:t xml:space="preserve"> Management System</w:t>
+      </w:r>
+    </w:p>
+    <w:p>
+      <w:pPr>
+        <w:numPr>
+          <w:ilvl w:val="0"/>
+          <w:numId w:val="8"/>
+        </w:numPr>
+        <w:spacing w:before="100" w:beforeAutospacing="1" w:after="100" w:afterAutospacing="1" w:line="240" w:lineRule="auto"/>
+        <w:rPr>
+          <w:rFonts w:ascii="Times New Roman" w:eastAsia="Times New Roman" w:hAnsi="Times New Roman" w:cs="Times New Roman"/>
+          <w:sz w:val="24"/>
+          <w:szCs w:val="24"/>
+        </w:rPr>
+      </w:pPr>
+      <w:r>
+        <w:rPr>
+          <w:rFonts w:ascii="Times New Roman" w:eastAsia="Times New Roman" w:hAnsi="Times New Roman" w:cs="Times New Roman"/>
+          <w:sz w:val="24"/>
+          <w:szCs w:val="24"/>
+        </w:rPr>
+        <w:lastRenderedPageBreak/>
+        <w:t xml:space="preserve">Features: </w:t>
+      </w:r>
+      <w:r>
+        <w:rPr>
+          <w:rFonts w:ascii="Times New Roman" w:eastAsia="Times New Roman" w:hAnsi="Times New Roman" w:cs="Times New Roman"/>
+          <w:sz w:val="24"/>
+          <w:szCs w:val="24"/>
+        </w:rPr>
+        <w:t>HR-Admin Department system, HMO Department, Inventory system, Payroll system, Billing system</w:t>
+      </w:r>
+      <w:r>
+        <w:rPr>
+          <w:rFonts w:ascii="Times New Roman" w:eastAsia="Times New Roman" w:hAnsi="Times New Roman" w:cs="Times New Roman"/>
+          <w:sz w:val="24"/>
+          <w:szCs w:val="24"/>
+        </w:rPr>
+        <w:t>.</w:t>
+      </w:r>
+      <w:r>
+        <w:rPr>
+          <w:rFonts w:ascii="Times New Roman" w:eastAsia="Times New Roman" w:hAnsi="Times New Roman" w:cs="Times New Roman"/>
+          <w:sz w:val="24"/>
+          <w:szCs w:val="24"/>
+        </w:rPr>
+        <w:t xml:space="preserve"> All in a single dashboard with a single login/logout system</w:t>
+      </w:r>
+    </w:p>
+    <w:p>
+      <w:pPr>
+        <w:numPr>
+          <w:ilvl w:val="0"/>
+          <w:numId w:val="8"/>
+        </w:numPr>
+        <w:spacing w:before="100" w:beforeAutospacing="1" w:after="100" w:afterAutospacing="1" w:line="240" w:lineRule="auto"/>
+        <w:rPr>
+          <w:rFonts w:ascii="Times New Roman" w:eastAsia="Times New Roman" w:hAnsi="Times New Roman" w:cs="Times New Roman"/>
+          <w:sz w:val="24"/>
+          <w:szCs w:val="24"/>
+        </w:rPr>
+      </w:pPr>
+      <w:r>
+        <w:rPr>
+          <w:rFonts w:ascii="Times New Roman" w:eastAsia="Times New Roman" w:hAnsi="Times New Roman" w:cs="Times New Roman"/>
+          <w:sz w:val="24"/>
+          <w:szCs w:val="24"/>
+        </w:rPr>
+        <w:t>Technologies: PHP (</w:t>
+      </w:r>
+      <w:proofErr w:type="spellStart"/>
+      <w:r>
+        <w:rPr>
+          <w:rFonts w:ascii="Times New Roman" w:eastAsia="Times New Roman" w:hAnsi="Times New Roman" w:cs="Times New Roman"/>
+          <w:sz w:val="24"/>
+          <w:szCs w:val="24"/>
+        </w:rPr>
         <w:t>MySQLi</w:t>
       </w:r>
       <w:proofErr w:type="spellEnd"/>
@@ -1547,6 +2652,27 @@
         </w:rPr>
         <w:t>.</w:t>
       </w:r>
+    </w:p>
+    <w:p>
+      <w:pPr>
+        <w:spacing w:before="100" w:beforeAutospacing="1" w:after="100" w:afterAutospacing="1" w:line="240" w:lineRule="auto"/>
+        <w:rPr>
+          <w:rFonts w:ascii="Times New Roman" w:eastAsia="Times New Roman" w:hAnsi="Times New Roman" w:cs="Times New Roman"/>
+          <w:sz w:val="24"/>
+          <w:szCs w:val="24"/>
+        </w:rPr>
+      </w:pPr>
+    </w:p>
+    <w:p>
+      <w:pPr>
+        <w:spacing w:before="100" w:beforeAutospacing="1" w:after="100" w:afterAutospacing="1" w:line="240" w:lineRule="auto"/>
+        <w:ind w:left="720"/>
+        <w:rPr>
+          <w:rFonts w:ascii="Times New Roman" w:eastAsia="Times New Roman" w:hAnsi="Times New Roman" w:cs="Times New Roman"/>
+          <w:sz w:val="24"/>
+          <w:szCs w:val="24"/>
+        </w:rPr>
+      </w:pPr>
     </w:p>
     <w:p>
       <w:pPr>
@@ -1695,7 +2821,6 @@
           <w:sz w:val="24"/>
           <w:szCs w:val="24"/>
         </w:rPr>
-        <w:lastRenderedPageBreak/>
         <w:t>Features: Authentication with JWT, create &amp; manage invoices, API endpoints for external integration, PDF generation.</w:t>
       </w:r>
     </w:p>
@@ -1773,26 +2898,6 @@
     </w:p>
     <w:p>
       <w:pPr>
-        <w:spacing w:after="0" w:line="240" w:lineRule="auto"/>
-        <w:rPr>
-          <w:rFonts w:ascii="Times New Roman" w:eastAsia="Times New Roman" w:hAnsi="Times New Roman" w:cs="Times New Roman"/>
-          <w:sz w:val="24"/>
-          <w:szCs w:val="24"/>
-        </w:rPr>
-      </w:pPr>
-      <w:r>
-        <w:rPr>
-          <w:rFonts w:ascii="Times New Roman" w:eastAsia="Times New Roman" w:hAnsi="Times New Roman" w:cs="Times New Roman"/>
-          <w:sz w:val="24"/>
-          <w:szCs w:val="24"/>
-        </w:rPr>
-        <w:pict>
-          <v:rect id="_x0000_i1028" style="width:0;height:1.5pt" o:hralign="center" o:hrstd="t" o:hr="t" fillcolor="#a0a0a0" stroked="f"/>
-        </w:pict>
-      </w:r>
-    </w:p>
-    <w:p>
-      <w:pPr>
         <w:spacing w:before="100" w:beforeAutospacing="1" w:after="100" w:afterAutospacing="1" w:line="240" w:lineRule="auto"/>
         <w:outlineLvl w:val="1"/>
         <w:rPr>
@@ -2004,26 +3109,6 @@
     </w:p>
     <w:p>
       <w:pPr>
-        <w:spacing w:after="0" w:line="240" w:lineRule="auto"/>
-        <w:rPr>
-          <w:rFonts w:ascii="Times New Roman" w:eastAsia="Times New Roman" w:hAnsi="Times New Roman" w:cs="Times New Roman"/>
-          <w:sz w:val="24"/>
-          <w:szCs w:val="24"/>
-        </w:rPr>
-      </w:pPr>
-      <w:r>
-        <w:rPr>
-          <w:rFonts w:ascii="Times New Roman" w:eastAsia="Times New Roman" w:hAnsi="Times New Roman" w:cs="Times New Roman"/>
-          <w:sz w:val="24"/>
-          <w:szCs w:val="24"/>
-        </w:rPr>
-        <w:pict>
-          <v:rect id="_x0000_i1029" style="width:0;height:1.5pt" o:hralign="center" o:hrstd="t" o:hr="t" fillcolor="#a0a0a0" stroked="f"/>
-        </w:pict>
-      </w:r>
-    </w:p>
-    <w:p>
-      <w:pPr>
         <w:spacing w:before="100" w:beforeAutospacing="1" w:after="100" w:afterAutospacing="1" w:line="240" w:lineRule="auto"/>
         <w:outlineLvl w:val="1"/>
         <w:rPr>
@@ -2194,28 +3279,6 @@
         </w:rPr>
         <w:t xml:space="preserve"> – Training young developers.</w:t>
       </w:r>
-      <w:bookmarkStart w:id="0" w:name="_GoBack"/>
-      <w:bookmarkEnd w:id="0"/>
-    </w:p>
-    <w:p>
-      <w:pPr>
-        <w:spacing w:after="0" w:line="240" w:lineRule="auto"/>
-        <w:rPr>
-          <w:rFonts w:ascii="Times New Roman" w:eastAsia="Times New Roman" w:hAnsi="Times New Roman" w:cs="Times New Roman"/>
-          <w:sz w:val="24"/>
-          <w:szCs w:val="24"/>
-        </w:rPr>
-      </w:pPr>
-      <w:r>
-        <w:rPr>
-          <w:rFonts w:ascii="Times New Roman" w:eastAsia="Times New Roman" w:hAnsi="Times New Roman" w:cs="Times New Roman"/>
-          <w:sz w:val="24"/>
-          <w:szCs w:val="24"/>
-        </w:rPr>
-        <w:pict>
-          <v:rect id="_x0000_i1030" style="width:0;height:1.5pt" o:hralign="center" o:hrstd="t" o:hr="t" fillcolor="#a0a0a0" stroked="f"/>
-        </w:pict>
-      </w:r>
     </w:p>
     <w:p>
       <w:pPr>
@@ -2279,7 +3342,7 @@
         </w:rPr>
         <w:t xml:space="preserve"> Email: </w:t>
       </w:r>
-      <w:hyperlink r:id="rId5" w:history="1">
+      <w:hyperlink r:id="rId7" w:history="1">
         <w:r>
           <w:rPr>
             <w:rFonts w:ascii="Times New Roman" w:eastAsia="Times New Roman" w:hAnsi="Times New Roman" w:cs="Times New Roman"/>
@@ -2403,6 +3466,19 @@
         </w:rPr>
         <w:t>(</w:t>
       </w:r>
+      <w:hyperlink r:id="rId8" w:history="1">
+        <w:r>
+          <w:rPr>
+            <w:rStyle w:val="Hyperlink"/>
+            <w:rFonts w:ascii="Times New Roman" w:eastAsia="Times New Roman" w:hAnsi="Times New Roman" w:cs="Times New Roman"/>
+            <w:i/>
+            <w:iCs/>
+            <w:sz w:val="24"/>
+            <w:szCs w:val="24"/>
+          </w:rPr>
+          <w:t>https://github.com/afunmibi</w:t>
+        </w:r>
+      </w:hyperlink>
       <w:r>
         <w:rPr>
           <w:rFonts w:ascii="Times New Roman" w:eastAsia="Times New Roman" w:hAnsi="Times New Roman" w:cs="Times New Roman"/>
@@ -2411,28 +3487,210 @@
           <w:sz w:val="24"/>
           <w:szCs w:val="24"/>
         </w:rPr>
-        <w:t>https://github.com/afunmibi</w:t>
-      </w:r>
-      <w:r>
-        <w:rPr>
-          <w:rFonts w:ascii="Times New Roman" w:eastAsia="Times New Roman" w:hAnsi="Times New Roman" w:cs="Times New Roman"/>
+        <w:t>)</w:t>
+      </w:r>
+    </w:p>
+    <w:p>
+      <w:pPr>
+        <w:numPr>
+          <w:ilvl w:val="0"/>
+          <w:numId w:val="13"/>
+        </w:numPr>
+        <w:spacing w:before="100" w:beforeAutospacing="1" w:after="100" w:afterAutospacing="1" w:line="240" w:lineRule="auto"/>
+        <w:rPr>
+          <w:rFonts w:ascii="Times New Roman" w:eastAsia="Times New Roman" w:hAnsi="Times New Roman" w:cs="Times New Roman"/>
+          <w:sz w:val="24"/>
+          <w:szCs w:val="24"/>
+        </w:rPr>
+      </w:pPr>
+      <w:r>
+        <w:rPr>
+          <w:sz w:val="24"/>
+          <w:szCs w:val="24"/>
+        </w:rPr>
+        <w:t>Portfolio</w:t>
+      </w:r>
+      <w:r>
+        <w:rPr>
           <w:i/>
-          <w:iCs/>
-          <w:sz w:val="24"/>
-          <w:szCs w:val="24"/>
-        </w:rPr>
-        <w:t>)</w:t>
-      </w:r>
+          <w:sz w:val="24"/>
+          <w:szCs w:val="24"/>
+        </w:rPr>
+        <w:t xml:space="preserve">: </w:t>
+      </w:r>
+      <w:r>
+        <w:rPr>
+          <w:i/>
+          <w:sz w:val="24"/>
+          <w:szCs w:val="24"/>
+        </w:rPr>
+        <w:t>http</w:t>
+      </w:r>
+      <w:sdt>
+        <w:sdtPr>
+          <w:rPr>
+            <w:i/>
+            <w:sz w:val="24"/>
+            <w:szCs w:val="24"/>
+          </w:rPr>
+          <w:alias w:val="Author"/>
+          <w:tag w:val=""/>
+          <w:id w:val="2086107771"/>
+          <w:placeholder>
+            <w:docPart w:val="30E3C459B6D1491187442D4F7D1B7D93"/>
+          </w:placeholder>
+          <w:dataBinding w:prefixMappings="xmlns:ns0='http://purl.org/dc/elements/1.1/' xmlns:ns1='http://schemas.openxmlformats.org/package/2006/metadata/core-properties' " w:xpath="/ns1:coreProperties[1]/ns0:creator[1]" w:storeItemID="{6C3C8BC8-F283-45AE-878A-BAB7291924A1}"/>
+          <w:text/>
+        </w:sdtPr>
+        <w:sdtEndPr/>
+        <w:sdtContent>
+          <w:r>
+            <w:rPr>
+              <w:i/>
+              <w:sz w:val="24"/>
+              <w:szCs w:val="24"/>
+            </w:rPr>
+            <w:t>s://felix-adewale-portfolio.vercel.app</w:t>
+          </w:r>
+        </w:sdtContent>
+      </w:sdt>
     </w:p>
     <w:p/>
     <w:sectPr>
+      <w:headerReference w:type="default" r:id="rId9"/>
       <w:pgSz w:w="12240" w:h="15840"/>
-      <w:pgMar w:top="1440" w:right="1440" w:bottom="1440" w:left="1440" w:header="720" w:footer="720" w:gutter="0"/>
+      <w:pgMar w:top="996" w:right="1440" w:bottom="450" w:left="1440" w:header="720" w:footer="720" w:gutter="0"/>
       <w:cols w:space="720"/>
       <w:docGrid w:linePitch="360"/>
     </w:sectPr>
   </w:body>
 </w:document>
+</file>
+
+<file path=word/endnotes.xml><?xml version="1.0" encoding="utf-8"?>
+<w:endnotes xmlns:wpc="http://schemas.microsoft.com/office/word/2010/wordprocessingCanvas" xmlns:cx="http://schemas.microsoft.com/office/drawing/2014/chartex" xmlns:mc="http://schemas.openxmlformats.org/markup-compatibility/2006" xmlns:o="urn:schemas-microsoft-com:office:office" xmlns:r="http://schemas.openxmlformats.org/officeDocument/2006/relationships" xmlns:m="http://schemas.openxmlformats.org/officeDocument/2006/math" xmlns:v="urn:schemas-microsoft-com:vml" xmlns:wp14="http://schemas.microsoft.com/office/word/2010/wordprocessingDrawing" xmlns:wp="http://schemas.openxmlformats.org/drawingml/2006/wordprocessingDrawing" xmlns:w10="urn:schemas-microsoft-com:office:word" xmlns:w="http://schemas.openxmlformats.org/wordprocessingml/2006/main" xmlns:w14="http://schemas.microsoft.com/office/word/2010/wordml" xmlns:w15="http://schemas.microsoft.com/office/word/2012/wordml" xmlns:w16se="http://schemas.microsoft.com/office/word/2015/wordml/symex" xmlns:wpg="http://schemas.microsoft.com/office/word/2010/wordprocessingGroup" xmlns:wpi="http://schemas.microsoft.com/office/word/2010/wordprocessingInk" xmlns:wne="http://schemas.microsoft.com/office/word/2006/wordml" xmlns:wps="http://schemas.microsoft.com/office/word/2010/wordprocessingShape" mc:Ignorable="w14 w15 w16se wp14">
+  <w:endnote w:type="separator" w:id="-1">
+    <w:p>
+      <w:pPr>
+        <w:spacing w:after="0" w:line="240" w:lineRule="auto"/>
+      </w:pPr>
+      <w:r>
+        <w:separator/>
+      </w:r>
+    </w:p>
+  </w:endnote>
+  <w:endnote w:type="continuationSeparator" w:id="0">
+    <w:p>
+      <w:pPr>
+        <w:spacing w:after="0" w:line="240" w:lineRule="auto"/>
+      </w:pPr>
+      <w:r>
+        <w:continuationSeparator/>
+      </w:r>
+    </w:p>
+  </w:endnote>
+</w:endnotes>
+</file>
+
+<file path=word/footnotes.xml><?xml version="1.0" encoding="utf-8"?>
+<w:footnotes xmlns:wpc="http://schemas.microsoft.com/office/word/2010/wordprocessingCanvas" xmlns:cx="http://schemas.microsoft.com/office/drawing/2014/chartex" xmlns:mc="http://schemas.openxmlformats.org/markup-compatibility/2006" xmlns:o="urn:schemas-microsoft-com:office:office" xmlns:r="http://schemas.openxmlformats.org/officeDocument/2006/relationships" xmlns:m="http://schemas.openxmlformats.org/officeDocument/2006/math" xmlns:v="urn:schemas-microsoft-com:vml" xmlns:wp14="http://schemas.microsoft.com/office/word/2010/wordprocessingDrawing" xmlns:wp="http://schemas.openxmlformats.org/drawingml/2006/wordprocessingDrawing" xmlns:w10="urn:schemas-microsoft-com:office:word" xmlns:w="http://schemas.openxmlformats.org/wordprocessingml/2006/main" xmlns:w14="http://schemas.microsoft.com/office/word/2010/wordml" xmlns:w15="http://schemas.microsoft.com/office/word/2012/wordml" xmlns:w16se="http://schemas.microsoft.com/office/word/2015/wordml/symex" xmlns:wpg="http://schemas.microsoft.com/office/word/2010/wordprocessingGroup" xmlns:wpi="http://schemas.microsoft.com/office/word/2010/wordprocessingInk" xmlns:wne="http://schemas.microsoft.com/office/word/2006/wordml" xmlns:wps="http://schemas.microsoft.com/office/word/2010/wordprocessingShape" mc:Ignorable="w14 w15 w16se wp14">
+  <w:footnote w:type="separator" w:id="-1">
+    <w:p>
+      <w:pPr>
+        <w:spacing w:after="0" w:line="240" w:lineRule="auto"/>
+      </w:pPr>
+      <w:r>
+        <w:separator/>
+      </w:r>
+    </w:p>
+  </w:footnote>
+  <w:footnote w:type="continuationSeparator" w:id="0">
+    <w:p>
+      <w:pPr>
+        <w:spacing w:after="0" w:line="240" w:lineRule="auto"/>
+      </w:pPr>
+      <w:r>
+        <w:continuationSeparator/>
+      </w:r>
+    </w:p>
+  </w:footnote>
+</w:footnotes>
+</file>
+
+<file path=word/header1.xml><?xml version="1.0" encoding="utf-8"?>
+<w:hdr xmlns:wpc="http://schemas.microsoft.com/office/word/2010/wordprocessingCanvas" xmlns:cx="http://schemas.microsoft.com/office/drawing/2014/chartex" xmlns:mc="http://schemas.openxmlformats.org/markup-compatibility/2006" xmlns:o="urn:schemas-microsoft-com:office:office" xmlns:r="http://schemas.openxmlformats.org/officeDocument/2006/relationships" xmlns:m="http://schemas.openxmlformats.org/officeDocument/2006/math" xmlns:v="urn:schemas-microsoft-com:vml" xmlns:wp14="http://schemas.microsoft.com/office/word/2010/wordprocessingDrawing" xmlns:wp="http://schemas.openxmlformats.org/drawingml/2006/wordprocessingDrawing" xmlns:w10="urn:schemas-microsoft-com:office:word" xmlns:w="http://schemas.openxmlformats.org/wordprocessingml/2006/main" xmlns:w14="http://schemas.microsoft.com/office/word/2010/wordml" xmlns:w15="http://schemas.microsoft.com/office/word/2012/wordml" xmlns:w16se="http://schemas.microsoft.com/office/word/2015/wordml/symex" xmlns:wpg="http://schemas.microsoft.com/office/word/2010/wordprocessingGroup" xmlns:wpi="http://schemas.microsoft.com/office/word/2010/wordprocessingInk" xmlns:wne="http://schemas.microsoft.com/office/word/2006/wordml" xmlns:wps="http://schemas.microsoft.com/office/word/2010/wordprocessingShape" mc:Ignorable="w14 w15 w16se wp14">
+  <w:p>
+    <w:pPr>
+      <w:pStyle w:val="Header"/>
+      <w:tabs>
+        <w:tab w:val="clear" w:pos="4680"/>
+        <w:tab w:val="clear" w:pos="9360"/>
+      </w:tabs>
+      <w:jc w:val="right"/>
+      <w:rPr>
+        <w:i/>
+        <w:sz w:val="24"/>
+        <w:szCs w:val="24"/>
+      </w:rPr>
+    </w:pPr>
+    <w:r>
+      <w:rPr>
+        <w:sz w:val="24"/>
+        <w:szCs w:val="24"/>
+      </w:rPr>
+      <w:t>Portfolio</w:t>
+    </w:r>
+    <w:r>
+      <w:rPr>
+        <w:i/>
+        <w:sz w:val="24"/>
+        <w:szCs w:val="24"/>
+      </w:rPr>
+      <w:t xml:space="preserve">: </w:t>
+    </w:r>
+    <w:r>
+      <w:rPr>
+        <w:i/>
+        <w:sz w:val="24"/>
+        <w:szCs w:val="24"/>
+      </w:rPr>
+      <w:t>http</w:t>
+    </w:r>
+    <w:sdt>
+      <w:sdtPr>
+        <w:rPr>
+          <w:i/>
+          <w:sz w:val="24"/>
+          <w:szCs w:val="24"/>
+        </w:rPr>
+        <w:alias w:val="Author"/>
+        <w:tag w:val=""/>
+        <w:id w:val="1359538315"/>
+        <w:placeholder>
+          <w:docPart w:val="BAB9BC22E1304A3CBDDB31B21249F231"/>
+        </w:placeholder>
+        <w:dataBinding w:prefixMappings="xmlns:ns0='http://purl.org/dc/elements/1.1/' xmlns:ns1='http://schemas.openxmlformats.org/package/2006/metadata/core-properties' " w:xpath="/ns1:coreProperties[1]/ns0:creator[1]" w:storeItemID="{6C3C8BC8-F283-45AE-878A-BAB7291924A1}"/>
+        <w:text/>
+      </w:sdtPr>
+      <w:sdtEndPr/>
+      <w:sdtContent>
+        <w:r>
+          <w:rPr>
+            <w:i/>
+            <w:sz w:val="24"/>
+            <w:szCs w:val="24"/>
+          </w:rPr>
+          <w:t>s://felix-adewale-portfolio.vercel.app</w:t>
+        </w:r>
+      </w:sdtContent>
+    </w:sdt>
+  </w:p>
+  <w:p>
+    <w:pPr>
+      <w:pStyle w:val="Header"/>
+    </w:pPr>
+  </w:p>
+</w:hdr>
 </file>
 
 <file path=word/numbering.xml><?xml version="1.0" encoding="utf-8"?>
@@ -4980,7 +6238,6 @@
     <w:name w:val="Hyperlink"/>
     <w:basedOn w:val="DefaultParagraphFont"/>
     <w:uiPriority w:val="99"/>
-    <w:semiHidden/>
     <w:unhideWhenUsed/>
     <w:rsid w:val="001D72B1"/>
     <w:rPr>
@@ -4988,7 +6245,649 @@
       <w:u w:val="single"/>
     </w:rPr>
   </w:style>
+  <w:style w:type="paragraph" w:styleId="Header">
+    <w:name w:val="header"/>
+    <w:basedOn w:val="Normal"/>
+    <w:link w:val="HeaderChar"/>
+    <w:uiPriority w:val="99"/>
+    <w:unhideWhenUsed/>
+    <w:rsid w:val="009D686E"/>
+    <w:pPr>
+      <w:tabs>
+        <w:tab w:val="center" w:pos="4680"/>
+        <w:tab w:val="right" w:pos="9360"/>
+      </w:tabs>
+      <w:spacing w:after="0" w:line="240" w:lineRule="auto"/>
+    </w:pPr>
+  </w:style>
+  <w:style w:type="character" w:customStyle="1" w:styleId="HeaderChar">
+    <w:name w:val="Header Char"/>
+    <w:basedOn w:val="DefaultParagraphFont"/>
+    <w:link w:val="Header"/>
+    <w:uiPriority w:val="99"/>
+    <w:rsid w:val="009D686E"/>
+  </w:style>
+  <w:style w:type="paragraph" w:styleId="Footer">
+    <w:name w:val="footer"/>
+    <w:basedOn w:val="Normal"/>
+    <w:link w:val="FooterChar"/>
+    <w:uiPriority w:val="99"/>
+    <w:unhideWhenUsed/>
+    <w:rsid w:val="009D686E"/>
+    <w:pPr>
+      <w:tabs>
+        <w:tab w:val="center" w:pos="4680"/>
+        <w:tab w:val="right" w:pos="9360"/>
+      </w:tabs>
+      <w:spacing w:after="0" w:line="240" w:lineRule="auto"/>
+    </w:pPr>
+  </w:style>
+  <w:style w:type="character" w:customStyle="1" w:styleId="FooterChar">
+    <w:name w:val="Footer Char"/>
+    <w:basedOn w:val="DefaultParagraphFont"/>
+    <w:link w:val="Footer"/>
+    <w:uiPriority w:val="99"/>
+    <w:rsid w:val="009D686E"/>
+  </w:style>
 </w:styles>
+</file>
+
+<file path=word/glossary/document.xml><?xml version="1.0" encoding="utf-8"?>
+<w:glossaryDocument xmlns:wpc="http://schemas.microsoft.com/office/word/2010/wordprocessingCanvas" xmlns:cx="http://schemas.microsoft.com/office/drawing/2014/chartex" xmlns:mc="http://schemas.openxmlformats.org/markup-compatibility/2006" xmlns:o="urn:schemas-microsoft-com:office:office" xmlns:r="http://schemas.openxmlformats.org/officeDocument/2006/relationships" xmlns:m="http://schemas.openxmlformats.org/officeDocument/2006/math" xmlns:v="urn:schemas-microsoft-com:vml" xmlns:wp14="http://schemas.microsoft.com/office/word/2010/wordprocessingDrawing" xmlns:wp="http://schemas.openxmlformats.org/drawingml/2006/wordprocessingDrawing" xmlns:w10="urn:schemas-microsoft-com:office:word" xmlns:w="http://schemas.openxmlformats.org/wordprocessingml/2006/main" xmlns:w14="http://schemas.microsoft.com/office/word/2010/wordml" xmlns:w15="http://schemas.microsoft.com/office/word/2012/wordml" xmlns:w16se="http://schemas.microsoft.com/office/word/2015/wordml/symex" xmlns:wpg="http://schemas.microsoft.com/office/word/2010/wordprocessingGroup" xmlns:wpi="http://schemas.microsoft.com/office/word/2010/wordprocessingInk" xmlns:wne="http://schemas.microsoft.com/office/word/2006/wordml" xmlns:wps="http://schemas.microsoft.com/office/word/2010/wordprocessingShape" mc:Ignorable="w14 w15 w16se wp14">
+  <w:docParts>
+    <w:docPart>
+      <w:docPartPr>
+        <w:name w:val="BAB9BC22E1304A3CBDDB31B21249F231"/>
+        <w:category>
+          <w:name w:val="General"/>
+          <w:gallery w:val="placeholder"/>
+        </w:category>
+        <w:types>
+          <w:type w:val="bbPlcHdr"/>
+        </w:types>
+        <w:behaviors>
+          <w:behavior w:val="content"/>
+        </w:behaviors>
+        <w:guid w:val="{D8744E89-F816-49FD-8BC0-72ABA6F41AB1}"/>
+      </w:docPartPr>
+      <w:docPartBody>
+        <w:p>
+          <w:pPr>
+            <w:pStyle w:val="BAB9BC22E1304A3CBDDB31B21249F231"/>
+          </w:pPr>
+          <w:r>
+            <w:t>[Author Name]</w:t>
+          </w:r>
+        </w:p>
+      </w:docPartBody>
+    </w:docPart>
+    <w:docPart>
+      <w:docPartPr>
+        <w:name w:val="30E3C459B6D1491187442D4F7D1B7D93"/>
+        <w:category>
+          <w:name w:val="General"/>
+          <w:gallery w:val="placeholder"/>
+        </w:category>
+        <w:types>
+          <w:type w:val="bbPlcHdr"/>
+        </w:types>
+        <w:behaviors>
+          <w:behavior w:val="content"/>
+        </w:behaviors>
+        <w:guid w:val="{BB4891DF-1238-47CE-B313-339CBBD1A87B}"/>
+      </w:docPartPr>
+      <w:docPartBody>
+        <w:p>
+          <w:pPr>
+            <w:pStyle w:val="30E3C459B6D1491187442D4F7D1B7D93"/>
+          </w:pPr>
+          <w:r>
+            <w:t>[Author Name]</w:t>
+          </w:r>
+        </w:p>
+      </w:docPartBody>
+    </w:docPart>
+  </w:docParts>
+</w:glossaryDocument>
+</file>
+
+<file path=word/glossary/fontTable.xml><?xml version="1.0" encoding="utf-8"?>
+<w:fonts xmlns:mc="http://schemas.openxmlformats.org/markup-compatibility/2006" xmlns:r="http://schemas.openxmlformats.org/officeDocument/2006/relationships" xmlns:w="http://schemas.openxmlformats.org/wordprocessingml/2006/main" xmlns:w14="http://schemas.microsoft.com/office/word/2010/wordml" xmlns:w15="http://schemas.microsoft.com/office/word/2012/wordml" xmlns:w16se="http://schemas.microsoft.com/office/word/2015/wordml/symex" mc:Ignorable="w14 w15 w16se">
+  <w:font w:name="Symbol">
+    <w:panose1 w:val="05050102010706020507"/>
+    <w:charset w:val="02"/>
+    <w:family w:val="roman"/>
+    <w:pitch w:val="variable"/>
+    <w:sig w:usb0="00000000" w:usb1="10000000" w:usb2="00000000" w:usb3="00000000" w:csb0="80000000" w:csb1="00000000"/>
+  </w:font>
+  <w:font w:name="Times New Roman">
+    <w:panose1 w:val="02020603050405020304"/>
+    <w:charset w:val="00"/>
+    <w:family w:val="roman"/>
+    <w:pitch w:val="variable"/>
+    <w:sig w:usb0="E0002EFF" w:usb1="C000785B" w:usb2="00000009" w:usb3="00000000" w:csb0="000001FF" w:csb1="00000000"/>
+  </w:font>
+  <w:font w:name="Courier New">
+    <w:panose1 w:val="02070309020205020404"/>
+    <w:charset w:val="00"/>
+    <w:family w:val="modern"/>
+    <w:pitch w:val="fixed"/>
+    <w:sig w:usb0="E0002EFF" w:usb1="C0007843" w:usb2="00000009" w:usb3="00000000" w:csb0="000001FF" w:csb1="00000000"/>
+  </w:font>
+  <w:font w:name="Wingdings">
+    <w:panose1 w:val="05000000000000000000"/>
+    <w:charset w:val="02"/>
+    <w:family w:val="auto"/>
+    <w:pitch w:val="variable"/>
+    <w:sig w:usb0="00000000" w:usb1="10000000" w:usb2="00000000" w:usb3="00000000" w:csb0="80000000" w:csb1="00000000"/>
+  </w:font>
+  <w:font w:name="Calibri">
+    <w:panose1 w:val="020F0502020204030204"/>
+    <w:charset w:val="00"/>
+    <w:family w:val="swiss"/>
+    <w:pitch w:val="variable"/>
+    <w:sig w:usb0="E4002EFF" w:usb1="C000247B" w:usb2="00000009" w:usb3="00000000" w:csb0="000001FF" w:csb1="00000000"/>
+  </w:font>
+  <w:font w:name="Segoe UI Symbol">
+    <w:panose1 w:val="020B0502040204020203"/>
+    <w:charset w:val="00"/>
+    <w:family w:val="swiss"/>
+    <w:pitch w:val="variable"/>
+    <w:sig w:usb0="800001E3" w:usb1="1200FFEF" w:usb2="00040000" w:usb3="00000000" w:csb0="00000001" w:csb1="00000000"/>
+  </w:font>
+  <w:font w:name="Calibri Light">
+    <w:panose1 w:val="020F0302020204030204"/>
+    <w:charset w:val="00"/>
+    <w:family w:val="swiss"/>
+    <w:pitch w:val="variable"/>
+    <w:sig w:usb0="E4002EFF" w:usb1="C000247B" w:usb2="00000009" w:usb3="00000000" w:csb0="000001FF" w:csb1="00000000"/>
+  </w:font>
+</w:fonts>
+</file>
+
+<file path=word/glossary/settings.xml><?xml version="1.0" encoding="utf-8"?>
+<w:settings xmlns:mc="http://schemas.openxmlformats.org/markup-compatibility/2006" xmlns:o="urn:schemas-microsoft-com:office:office" xmlns:r="http://schemas.openxmlformats.org/officeDocument/2006/relationships" xmlns:m="http://schemas.openxmlformats.org/officeDocument/2006/math" xmlns:v="urn:schemas-microsoft-com:vml" xmlns:w10="urn:schemas-microsoft-com:office:word" xmlns:w="http://schemas.openxmlformats.org/wordprocessingml/2006/main" xmlns:w14="http://schemas.microsoft.com/office/word/2010/wordml" xmlns:w15="http://schemas.microsoft.com/office/word/2012/wordml" xmlns:w16se="http://schemas.microsoft.com/office/word/2015/wordml/symex" xmlns:sl="http://schemas.openxmlformats.org/schemaLibrary/2006/main" mc:Ignorable="w14 w15 w16se">
+  <w:view w:val="normal"/>
+  <w:defaultTabStop w:val="720"/>
+  <w:characterSpacingControl w:val="doNotCompress"/>
+  <w:compat>
+    <w:useFELayout/>
+    <w:compatSetting w:name="compatibilityMode" w:uri="http://schemas.microsoft.com/office/word" w:val="15"/>
+    <w:compatSetting w:name="overrideTableStyleFontSizeAndJustification" w:uri="http://schemas.microsoft.com/office/word" w:val="1"/>
+    <w:compatSetting w:name="enableOpenTypeFeatures" w:uri="http://schemas.microsoft.com/office/word" w:val="1"/>
+    <w:compatSetting w:name="doNotFlipMirrorIndents" w:uri="http://schemas.microsoft.com/office/word" w:val="1"/>
+    <w:compatSetting w:name="differentiateMultirowTableHeaders" w:uri="http://schemas.microsoft.com/office/word" w:val="1"/>
+  </w:compat>
+  <w:rsids>
+    <w:rsidRoot w:val="0000495E"/>
+    <w:rsid w:val="0000495E"/>
+    <w:rsid w:val="0073549D"/>
+    <w:rsid w:val="007A47AC"/>
+    <w:rsid w:val="00A12952"/>
+    <w:rsid w:val="00C253E6"/>
+  </w:rsids>
+  <m:mathPr>
+    <m:mathFont m:val="Cambria Math"/>
+    <m:brkBin m:val="before"/>
+    <m:brkBinSub m:val="--"/>
+    <m:smallFrac m:val="0"/>
+    <m:dispDef/>
+    <m:lMargin m:val="0"/>
+    <m:rMargin m:val="0"/>
+    <m:defJc m:val="centerGroup"/>
+    <m:wrapIndent m:val="1440"/>
+    <m:intLim m:val="subSup"/>
+    <m:naryLim m:val="undOvr"/>
+  </m:mathPr>
+  <w:themeFontLang w:val="en-US"/>
+  <w:clrSchemeMapping w:bg1="light1" w:t1="dark1" w:bg2="light2" w:t2="dark2" w:accent1="accent1" w:accent2="accent2" w:accent3="accent3" w:accent4="accent4" w:accent5="accent5" w:accent6="accent6" w:hyperlink="hyperlink" w:followedHyperlink="followedHyperlink"/>
+  <w:decimalSymbol w:val="."/>
+  <w:listSeparator w:val=","/>
+  <w15:chartTrackingRefBased/>
+</w:settings>
+</file>
+
+<file path=word/glossary/styles.xml><?xml version="1.0" encoding="utf-8"?>
+<w:styles xmlns:mc="http://schemas.openxmlformats.org/markup-compatibility/2006" xmlns:r="http://schemas.openxmlformats.org/officeDocument/2006/relationships" xmlns:w="http://schemas.openxmlformats.org/wordprocessingml/2006/main" xmlns:w14="http://schemas.microsoft.com/office/word/2010/wordml" xmlns:w15="http://schemas.microsoft.com/office/word/2012/wordml" xmlns:w16se="http://schemas.microsoft.com/office/word/2015/wordml/symex" mc:Ignorable="w14 w15 w16se">
+  <w:docDefaults>
+    <w:rPrDefault>
+      <w:rPr>
+        <w:rFonts w:asciiTheme="minorHAnsi" w:eastAsiaTheme="minorEastAsia" w:hAnsiTheme="minorHAnsi" w:cstheme="minorBidi"/>
+        <w:sz w:val="22"/>
+        <w:szCs w:val="22"/>
+        <w:lang w:val="en-US" w:eastAsia="en-US" w:bidi="ar-SA"/>
+      </w:rPr>
+    </w:rPrDefault>
+    <w:pPrDefault>
+      <w:pPr>
+        <w:spacing w:after="160" w:line="259" w:lineRule="auto"/>
+      </w:pPr>
+    </w:pPrDefault>
+  </w:docDefaults>
+  <w:latentStyles w:defLockedState="0" w:defUIPriority="99" w:defSemiHidden="0" w:defUnhideWhenUsed="0" w:defQFormat="0" w:count="371">
+    <w:lsdException w:name="Normal" w:uiPriority="0" w:qFormat="1"/>
+    <w:lsdException w:name="heading 1" w:uiPriority="9" w:qFormat="1"/>
+    <w:lsdException w:name="heading 2" w:semiHidden="1" w:uiPriority="9" w:unhideWhenUsed="1" w:qFormat="1"/>
+    <w:lsdException w:name="heading 3" w:semiHidden="1" w:uiPriority="9" w:unhideWhenUsed="1" w:qFormat="1"/>
+    <w:lsdException w:name="heading 4" w:semiHidden="1" w:uiPriority="9" w:unhideWhenUsed="1" w:qFormat="1"/>
+    <w:lsdException w:name="heading 5" w:semiHidden="1" w:uiPriority="9" w:unhideWhenUsed="1" w:qFormat="1"/>
+    <w:lsdException w:name="heading 6" w:semiHidden="1" w:uiPriority="9" w:unhideWhenUsed="1" w:qFormat="1"/>
+    <w:lsdException w:name="heading 7" w:semiHidden="1" w:uiPriority="9" w:unhideWhenUsed="1" w:qFormat="1"/>
+    <w:lsdException w:name="heading 8" w:semiHidden="1" w:uiPriority="9" w:unhideWhenUsed="1" w:qFormat="1"/>
+    <w:lsdException w:name="heading 9" w:semiHidden="1" w:uiPriority="9" w:unhideWhenUsed="1" w:qFormat="1"/>
+    <w:lsdException w:name="index 1" w:semiHidden="1" w:unhideWhenUsed="1"/>
+    <w:lsdException w:name="index 2" w:semiHidden="1" w:unhideWhenUsed="1"/>
+    <w:lsdException w:name="index 3" w:semiHidden="1" w:unhideWhenUsed="1"/>
+    <w:lsdException w:name="index 4" w:semiHidden="1" w:unhideWhenUsed="1"/>
+    <w:lsdException w:name="index 5" w:semiHidden="1" w:unhideWhenUsed="1"/>
+    <w:lsdException w:name="index 6" w:semiHidden="1" w:unhideWhenUsed="1"/>
+    <w:lsdException w:name="index 7" w:semiHidden="1" w:unhideWhenUsed="1"/>
+    <w:lsdException w:name="index 8" w:semiHidden="1" w:unhideWhenUsed="1"/>
+    <w:lsdException w:name="index 9" w:semiHidden="1" w:unhideWhenUsed="1"/>
+    <w:lsdException w:name="toc 1" w:semiHidden="1" w:uiPriority="39" w:unhideWhenUsed="1"/>
+    <w:lsdException w:name="toc 2" w:semiHidden="1" w:uiPriority="39" w:unhideWhenUsed="1"/>
+    <w:lsdException w:name="toc 3" w:semiHidden="1" w:uiPriority="39" w:unhideWhenUsed="1"/>
+    <w:lsdException w:name="toc 4" w:semiHidden="1" w:uiPriority="39" w:unhideWhenUsed="1"/>
+    <w:lsdException w:name="toc 5" w:semiHidden="1" w:uiPriority="39" w:unhideWhenUsed="1"/>
+    <w:lsdException w:name="toc 6" w:semiHidden="1" w:uiPriority="39" w:unhideWhenUsed="1"/>
+    <w:lsdException w:name="toc 7" w:semiHidden="1" w:uiPriority="39" w:unhideWhenUsed="1"/>
+    <w:lsdException w:name="toc 8" w:semiHidden="1" w:uiPriority="39" w:unhideWhenUsed="1"/>
+    <w:lsdException w:name="toc 9" w:semiHidden="1" w:uiPriority="39" w:unhideWhenUsed="1"/>
+    <w:lsdException w:name="Normal Indent" w:semiHidden="1" w:unhideWhenUsed="1"/>
+    <w:lsdException w:name="footnote text" w:semiHidden="1" w:unhideWhenUsed="1"/>
+    <w:lsdException w:name="annotation text" w:semiHidden="1" w:unhideWhenUsed="1"/>
+    <w:lsdException w:name="header" w:semiHidden="1" w:unhideWhenUsed="1"/>
+    <w:lsdException w:name="footer" w:semiHidden="1" w:unhideWhenUsed="1"/>
+    <w:lsdException w:name="index heading" w:semiHidden="1" w:unhideWhenUsed="1"/>
+    <w:lsdException w:name="caption" w:semiHidden="1" w:uiPriority="35" w:unhideWhenUsed="1" w:qFormat="1"/>
+    <w:lsdException w:name="table of figures" w:semiHidden="1" w:unhideWhenUsed="1"/>
+    <w:lsdException w:name="envelope address" w:semiHidden="1" w:unhideWhenUsed="1"/>
+    <w:lsdException w:name="envelope return" w:semiHidden="1" w:unhideWhenUsed="1"/>
+    <w:lsdException w:name="footnote reference" w:semiHidden="1" w:unhideWhenUsed="1"/>
+    <w:lsdException w:name="annotation reference" w:semiHidden="1" w:unhideWhenUsed="1"/>
+    <w:lsdException w:name="line number" w:semiHidden="1" w:unhideWhenUsed="1"/>
+    <w:lsdException w:name="page number" w:semiHidden="1" w:unhideWhenUsed="1"/>
+    <w:lsdException w:name="endnote reference" w:semiHidden="1" w:unhideWhenUsed="1"/>
+    <w:lsdException w:name="endnote text" w:semiHidden="1" w:unhideWhenUsed="1"/>
+    <w:lsdException w:name="table of authorities" w:semiHidden="1" w:unhideWhenUsed="1"/>
+    <w:lsdException w:name="macro" w:semiHidden="1" w:unhideWhenUsed="1"/>
+    <w:lsdException w:name="toa heading" w:semiHidden="1" w:unhideWhenUsed="1"/>
+    <w:lsdException w:name="List" w:semiHidden="1" w:unhideWhenUsed="1"/>
+    <w:lsdException w:name="List Bullet" w:semiHidden="1" w:unhideWhenUsed="1"/>
+    <w:lsdException w:name="List Number" w:semiHidden="1" w:unhideWhenUsed="1"/>
+    <w:lsdException w:name="List 2" w:semiHidden="1" w:unhideWhenUsed="1"/>
+    <w:lsdException w:name="List 3" w:semiHidden="1" w:unhideWhenUsed="1"/>
+    <w:lsdException w:name="List 4" w:semiHidden="1" w:unhideWhenUsed="1"/>
+    <w:lsdException w:name="List 5" w:semiHidden="1" w:unhideWhenUsed="1"/>
+    <w:lsdException w:name="List Bullet 2" w:semiHidden="1" w:unhideWhenUsed="1"/>
+    <w:lsdException w:name="List Bullet 3" w:semiHidden="1" w:unhideWhenUsed="1"/>
+    <w:lsdException w:name="List Bullet 4" w:semiHidden="1" w:unhideWhenUsed="1"/>
+    <w:lsdException w:name="List Bullet 5" w:semiHidden="1" w:unhideWhenUsed="1"/>
+    <w:lsdException w:name="List Number 2" w:semiHidden="1" w:unhideWhenUsed="1"/>
+    <w:lsdException w:name="List Number 3" w:semiHidden="1" w:unhideWhenUsed="1"/>
+    <w:lsdException w:name="List Number 4" w:semiHidden="1" w:unhideWhenUsed="1"/>
+    <w:lsdException w:name="List Number 5" w:semiHidden="1" w:unhideWhenUsed="1"/>
+    <w:lsdException w:name="Title" w:uiPriority="10" w:qFormat="1"/>
+    <w:lsdException w:name="Closing" w:semiHidden="1" w:unhideWhenUsed="1"/>
+    <w:lsdException w:name="Signature" w:semiHidden="1" w:unhideWhenUsed="1"/>
+    <w:lsdException w:name="Default Paragraph Font" w:semiHidden="1" w:uiPriority="1" w:unhideWhenUsed="1"/>
+    <w:lsdException w:name="Body Text" w:semiHidden="1" w:unhideWhenUsed="1"/>
+    <w:lsdException w:name="Body Text Indent" w:semiHidden="1" w:unhideWhenUsed="1"/>
+    <w:lsdException w:name="List Continue" w:semiHidden="1" w:unhideWhenUsed="1"/>
+    <w:lsdException w:name="List Continue 2" w:semiHidden="1" w:unhideWhenUsed="1"/>
+    <w:lsdException w:name="List Continue 3" w:semiHidden="1" w:unhideWhenUsed="1"/>
+    <w:lsdException w:name="List Continue 4" w:semiHidden="1" w:unhideWhenUsed="1"/>
+    <w:lsdException w:name="List Continue 5" w:semiHidden="1" w:unhideWhenUsed="1"/>
+    <w:lsdException w:name="Message Header" w:semiHidden="1" w:unhideWhenUsed="1"/>
+    <w:lsdException w:name="Subtitle" w:uiPriority="11" w:qFormat="1"/>
+    <w:lsdException w:name="Salutation" w:semiHidden="1" w:unhideWhenUsed="1"/>
+    <w:lsdException w:name="Date" w:semiHidden="1" w:unhideWhenUsed="1"/>
+    <w:lsdException w:name="Body Text First Indent" w:semiHidden="1" w:unhideWhenUsed="1"/>
+    <w:lsdException w:name="Body Text First Indent 2" w:semiHidden="1" w:unhideWhenUsed="1"/>
+    <w:lsdException w:name="Note Heading" w:semiHidden="1" w:unhideWhenUsed="1"/>
+    <w:lsdException w:name="Body Text 2" w:semiHidden="1" w:unhideWhenUsed="1"/>
+    <w:lsdException w:name="Body Text 3" w:semiHidden="1" w:unhideWhenUsed="1"/>
+    <w:lsdException w:name="Body Text Indent 2" w:semiHidden="1" w:unhideWhenUsed="1"/>
+    <w:lsdException w:name="Body Text Indent 3" w:semiHidden="1" w:unhideWhenUsed="1"/>
+    <w:lsdException w:name="Block Text" w:semiHidden="1" w:unhideWhenUsed="1"/>
+    <w:lsdException w:name="Hyperlink" w:semiHidden="1" w:unhideWhenUsed="1"/>
+    <w:lsdException w:name="FollowedHyperlink" w:semiHidden="1" w:unhideWhenUsed="1"/>
+    <w:lsdException w:name="Strong" w:uiPriority="22" w:qFormat="1"/>
+    <w:lsdException w:name="Emphasis" w:uiPriority="20" w:qFormat="1"/>
+    <w:lsdException w:name="Document Map" w:semiHidden="1" w:unhideWhenUsed="1"/>
+    <w:lsdException w:name="Plain Text" w:semiHidden="1" w:unhideWhenUsed="1"/>
+    <w:lsdException w:name="E-mail Signature" w:semiHidden="1" w:unhideWhenUsed="1"/>
+    <w:lsdException w:name="HTML Top of Form" w:semiHidden="1" w:unhideWhenUsed="1"/>
+    <w:lsdException w:name="HTML Bottom of Form" w:semiHidden="1" w:unhideWhenUsed="1"/>
+    <w:lsdException w:name="Normal (Web)" w:semiHidden="1" w:unhideWhenUsed="1"/>
+    <w:lsdException w:name="HTML Acronym" w:semiHidden="1" w:unhideWhenUsed="1"/>
+    <w:lsdException w:name="HTML Address" w:semiHidden="1" w:unhideWhenUsed="1"/>
+    <w:lsdException w:name="HTML Cite" w:semiHidden="1" w:unhideWhenUsed="1"/>
+    <w:lsdException w:name="HTML Code" w:semiHidden="1" w:unhideWhenUsed="1"/>
+    <w:lsdException w:name="HTML Definition" w:semiHidden="1" w:unhideWhenUsed="1"/>
+    <w:lsdException w:name="HTML Keyboard" w:semiHidden="1" w:unhideWhenUsed="1"/>
+    <w:lsdException w:name="HTML Preformatted" w:semiHidden="1" w:unhideWhenUsed="1"/>
+    <w:lsdException w:name="HTML Sample" w:semiHidden="1" w:unhideWhenUsed="1"/>
+    <w:lsdException w:name="HTML Typewriter" w:semiHidden="1" w:unhideWhenUsed="1"/>
+    <w:lsdException w:name="HTML Variable" w:semiHidden="1" w:unhideWhenUsed="1"/>
+    <w:lsdException w:name="Normal Table" w:semiHidden="1" w:unhideWhenUsed="1"/>
+    <w:lsdException w:name="annotation subject" w:semiHidden="1" w:unhideWhenUsed="1"/>
+    <w:lsdException w:name="No List" w:semiHidden="1" w:unhideWhenUsed="1"/>
+    <w:lsdException w:name="Outline List 1" w:semiHidden="1" w:unhideWhenUsed="1"/>
+    <w:lsdException w:name="Outline List 2" w:semiHidden="1" w:unhideWhenUsed="1"/>
+    <w:lsdException w:name="Outline List 3" w:semiHidden="1" w:unhideWhenUsed="1"/>
+    <w:lsdException w:name="Table Simple 1" w:semiHidden="1" w:unhideWhenUsed="1"/>
+    <w:lsdException w:name="Table Simple 2" w:semiHidden="1" w:unhideWhenUsed="1"/>
+    <w:lsdException w:name="Table Simple 3" w:semiHidden="1" w:unhideWhenUsed="1"/>
+    <w:lsdException w:name="Table Classic 1" w:semiHidden="1" w:unhideWhenUsed="1"/>
+    <w:lsdException w:name="Table Classic 2" w:semiHidden="1" w:unhideWhenUsed="1"/>
+    <w:lsdException w:name="Table Classic 3" w:semiHidden="1" w:unhideWhenUsed="1"/>
+    <w:lsdException w:name="Table Classic 4" w:semiHidden="1" w:unhideWhenUsed="1"/>
+    <w:lsdException w:name="Table Colorful 1" w:semiHidden="1" w:unhideWhenUsed="1"/>
+    <w:lsdException w:name="Table Colorful 2" w:semiHidden="1" w:unhideWhenUsed="1"/>
+    <w:lsdException w:name="Table Colorful 3" w:semiHidden="1" w:unhideWhenUsed="1"/>
+    <w:lsdException w:name="Table Columns 1" w:semiHidden="1" w:unhideWhenUsed="1"/>
+    <w:lsdException w:name="Table Columns 2" w:semiHidden="1" w:unhideWhenUsed="1"/>
+    <w:lsdException w:name="Table Columns 3" w:semiHidden="1" w:unhideWhenUsed="1"/>
+    <w:lsdException w:name="Table Columns 4" w:semiHidden="1" w:unhideWhenUsed="1"/>
+    <w:lsdException w:name="Table Columns 5" w:semiHidden="1" w:unhideWhenUsed="1"/>
+    <w:lsdException w:name="Table Grid 1" w:semiHidden="1" w:unhideWhenUsed="1"/>
+    <w:lsdException w:name="Table Grid 2" w:semiHidden="1" w:unhideWhenUsed="1"/>
+    <w:lsdException w:name="Table Grid 3" w:semiHidden="1" w:unhideWhenUsed="1"/>
+    <w:lsdException w:name="Table Grid 4" w:semiHidden="1" w:unhideWhenUsed="1"/>
+    <w:lsdException w:name="Table Grid 5" w:semiHidden="1" w:unhideWhenUsed="1"/>
+    <w:lsdException w:name="Table Grid 6" w:semiHidden="1" w:unhideWhenUsed="1"/>
+    <w:lsdException w:name="Table Grid 7" w:semiHidden="1" w:unhideWhenUsed="1"/>
+    <w:lsdException w:name="Table Grid 8" w:semiHidden="1" w:unhideWhenUsed="1"/>
+    <w:lsdException w:name="Table List 1" w:semiHidden="1" w:unhideWhenUsed="1"/>
+    <w:lsdException w:name="Table List 2" w:semiHidden="1" w:unhideWhenUsed="1"/>
+    <w:lsdException w:name="Table List 3" w:semiHidden="1" w:unhideWhenUsed="1"/>
+    <w:lsdException w:name="Table List 4" w:semiHidden="1" w:unhideWhenUsed="1"/>
+    <w:lsdException w:name="Table List 5" w:semiHidden="1" w:unhideWhenUsed="1"/>
+    <w:lsdException w:name="Table List 6" w:semiHidden="1" w:unhideWhenUsed="1"/>
+    <w:lsdException w:name="Table List 7" w:semiHidden="1" w:unhideWhenUsed="1"/>
+    <w:lsdException w:name="Table List 8" w:semiHidden="1" w:unhideWhenUsed="1"/>
+    <w:lsdException w:name="Table 3D effects 1" w:semiHidden="1" w:unhideWhenUsed="1"/>
+    <w:lsdException w:name="Table 3D effects 2" w:semiHidden="1" w:unhideWhenUsed="1"/>
+    <w:lsdException w:name="Table 3D effects 3" w:semiHidden="1" w:unhideWhenUsed="1"/>
+    <w:lsdException w:name="Table Contemporary" w:semiHidden="1" w:unhideWhenUsed="1"/>
+    <w:lsdException w:name="Table Elegant" w:semiHidden="1" w:unhideWhenUsed="1"/>
+    <w:lsdException w:name="Table Professional" w:semiHidden="1" w:unhideWhenUsed="1"/>
+    <w:lsdException w:name="Table Subtle 1" w:semiHidden="1" w:unhideWhenUsed="1"/>
+    <w:lsdException w:name="Table Subtle 2" w:semiHidden="1" w:unhideWhenUsed="1"/>
+    <w:lsdException w:name="Table Web 1" w:semiHidden="1" w:unhideWhenUsed="1"/>
+    <w:lsdException w:name="Table Web 2" w:semiHidden="1" w:unhideWhenUsed="1"/>
+    <w:lsdException w:name="Table Web 3" w:semiHidden="1" w:unhideWhenUsed="1"/>
+    <w:lsdException w:name="Balloon Text" w:semiHidden="1" w:unhideWhenUsed="1"/>
+    <w:lsdException w:name="Table Grid" w:uiPriority="39"/>
+    <w:lsdException w:name="Table Theme" w:semiHidden="1" w:unhideWhenUsed="1"/>
+    <w:lsdException w:name="Placeholder Text" w:semiHidden="1"/>
+    <w:lsdException w:name="No Spacing" w:uiPriority="1" w:qFormat="1"/>
+    <w:lsdException w:name="Light Shading" w:uiPriority="60"/>
+    <w:lsdException w:name="Light List" w:uiPriority="61"/>
+    <w:lsdException w:name="Light Grid" w:uiPriority="62"/>
+    <w:lsdException w:name="Medium Shading 1" w:uiPriority="63"/>
+    <w:lsdException w:name="Medium Shading 2" w:uiPriority="64"/>
+    <w:lsdException w:name="Medium List 1" w:uiPriority="65"/>
+    <w:lsdException w:name="Medium List 2" w:uiPriority="66"/>
+    <w:lsdException w:name="Medium Grid 1" w:uiPriority="67"/>
+    <w:lsdException w:name="Medium Grid 2" w:uiPriority="68"/>
+    <w:lsdException w:name="Medium Grid 3" w:uiPriority="69"/>
+    <w:lsdException w:name="Dark List" w:uiPriority="70"/>
+    <w:lsdException w:name="Colorful Shading" w:uiPriority="71"/>
+    <w:lsdException w:name="Colorful List" w:uiPriority="72"/>
+    <w:lsdException w:name="Colorful Grid" w:uiPriority="73"/>
+    <w:lsdException w:name="Light Shading Accent 1" w:uiPriority="60"/>
+    <w:lsdException w:name="Light List Accent 1" w:uiPriority="61"/>
+    <w:lsdException w:name="Light Grid Accent 1" w:uiPriority="62"/>
+    <w:lsdException w:name="Medium Shading 1 Accent 1" w:uiPriority="63"/>
+    <w:lsdException w:name="Medium Shading 2 Accent 1" w:uiPriority="64"/>
+    <w:lsdException w:name="Medium List 1 Accent 1" w:uiPriority="65"/>
+    <w:lsdException w:name="Revision" w:semiHidden="1"/>
+    <w:lsdException w:name="List Paragraph" w:uiPriority="34" w:qFormat="1"/>
+    <w:lsdException w:name="Quote" w:uiPriority="29" w:qFormat="1"/>
+    <w:lsdException w:name="Intense Quote" w:uiPriority="30" w:qFormat="1"/>
+    <w:lsdException w:name="Medium List 2 Accent 1" w:uiPriority="66"/>
+    <w:lsdException w:name="Medium Grid 1 Accent 1" w:uiPriority="67"/>
+    <w:lsdException w:name="Medium Grid 2 Accent 1" w:uiPriority="68"/>
+    <w:lsdException w:name="Medium Grid 3 Accent 1" w:uiPriority="69"/>
+    <w:lsdException w:name="Dark List Accent 1" w:uiPriority="70"/>
+    <w:lsdException w:name="Colorful Shading Accent 1" w:uiPriority="71"/>
+    <w:lsdException w:name="Colorful List Accent 1" w:uiPriority="72"/>
+    <w:lsdException w:name="Colorful Grid Accent 1" w:uiPriority="73"/>
+    <w:lsdException w:name="Light Shading Accent 2" w:uiPriority="60"/>
+    <w:lsdException w:name="Light List Accent 2" w:uiPriority="61"/>
+    <w:lsdException w:name="Light Grid Accent 2" w:uiPriority="62"/>
+    <w:lsdException w:name="Medium Shading 1 Accent 2" w:uiPriority="63"/>
+    <w:lsdException w:name="Medium Shading 2 Accent 2" w:uiPriority="64"/>
+    <w:lsdException w:name="Medium List 1 Accent 2" w:uiPriority="65"/>
+    <w:lsdException w:name="Medium List 2 Accent 2" w:uiPriority="66"/>
+    <w:lsdException w:name="Medium Grid 1 Accent 2" w:uiPriority="67"/>
+    <w:lsdException w:name="Medium Grid 2 Accent 2" w:uiPriority="68"/>
+    <w:lsdException w:name="Medium Grid 3 Accent 2" w:uiPriority="69"/>
+    <w:lsdException w:name="Dark List Accent 2" w:uiPriority="70"/>
+    <w:lsdException w:name="Colorful Shading Accent 2" w:uiPriority="71"/>
+    <w:lsdException w:name="Colorful List Accent 2" w:uiPriority="72"/>
+    <w:lsdException w:name="Colorful Grid Accent 2" w:uiPriority="73"/>
+    <w:lsdException w:name="Light Shading Accent 3" w:uiPriority="60"/>
+    <w:lsdException w:name="Light List Accent 3" w:uiPriority="61"/>
+    <w:lsdException w:name="Light Grid Accent 3" w:uiPriority="62"/>
+    <w:lsdException w:name="Medium Shading 1 Accent 3" w:uiPriority="63"/>
+    <w:lsdException w:name="Medium Shading 2 Accent 3" w:uiPriority="64"/>
+    <w:lsdException w:name="Medium List 1 Accent 3" w:uiPriority="65"/>
+    <w:lsdException w:name="Medium List 2 Accent 3" w:uiPriority="66"/>
+    <w:lsdException w:name="Medium Grid 1 Accent 3" w:uiPriority="67"/>
+    <w:lsdException w:name="Medium Grid 2 Accent 3" w:uiPriority="68"/>
+    <w:lsdException w:name="Medium Grid 3 Accent 3" w:uiPriority="69"/>
+    <w:lsdException w:name="Dark List Accent 3" w:uiPriority="70"/>
+    <w:lsdException w:name="Colorful Shading Accent 3" w:uiPriority="71"/>
+    <w:lsdException w:name="Colorful List Accent 3" w:uiPriority="72"/>
+    <w:lsdException w:name="Colorful Grid Accent 3" w:uiPriority="73"/>
+    <w:lsdException w:name="Light Shading Accent 4" w:uiPriority="60"/>
+    <w:lsdException w:name="Light List Accent 4" w:uiPriority="61"/>
+    <w:lsdException w:name="Light Grid Accent 4" w:uiPriority="62"/>
+    <w:lsdException w:name="Medium Shading 1 Accent 4" w:uiPriority="63"/>
+    <w:lsdException w:name="Medium Shading 2 Accent 4" w:uiPriority="64"/>
+    <w:lsdException w:name="Medium List 1 Accent 4" w:uiPriority="65"/>
+    <w:lsdException w:name="Medium List 2 Accent 4" w:uiPriority="66"/>
+    <w:lsdException w:name="Medium Grid 1 Accent 4" w:uiPriority="67"/>
+    <w:lsdException w:name="Medium Grid 2 Accent 4" w:uiPriority="68"/>
+    <w:lsdException w:name="Medium Grid 3 Accent 4" w:uiPriority="69"/>
+    <w:lsdException w:name="Dark List Accent 4" w:uiPriority="70"/>
+    <w:lsdException w:name="Colorful Shading Accent 4" w:uiPriority="71"/>
+    <w:lsdException w:name="Colorful List Accent 4" w:uiPriority="72"/>
+    <w:lsdException w:name="Colorful Grid Accent 4" w:uiPriority="73"/>
+    <w:lsdException w:name="Light Shading Accent 5" w:uiPriority="60"/>
+    <w:lsdException w:name="Light List Accent 5" w:uiPriority="61"/>
+    <w:lsdException w:name="Light Grid Accent 5" w:uiPriority="62"/>
+    <w:lsdException w:name="Medium Shading 1 Accent 5" w:uiPriority="63"/>
+    <w:lsdException w:name="Medium Shading 2 Accent 5" w:uiPriority="64"/>
+    <w:lsdException w:name="Medium List 1 Accent 5" w:uiPriority="65"/>
+    <w:lsdException w:name="Medium List 2 Accent 5" w:uiPriority="66"/>
+    <w:lsdException w:name="Medium Grid 1 Accent 5" w:uiPriority="67"/>
+    <w:lsdException w:name="Medium Grid 2 Accent 5" w:uiPriority="68"/>
+    <w:lsdException w:name="Medium Grid 3 Accent 5" w:uiPriority="69"/>
+    <w:lsdException w:name="Dark List Accent 5" w:uiPriority="70"/>
+    <w:lsdException w:name="Colorful Shading Accent 5" w:uiPriority="71"/>
+    <w:lsdException w:name="Colorful List Accent 5" w:uiPriority="72"/>
+    <w:lsdException w:name="Colorful Grid Accent 5" w:uiPriority="73"/>
+    <w:lsdException w:name="Light Shading Accent 6" w:uiPriority="60"/>
+    <w:lsdException w:name="Light List Accent 6" w:uiPriority="61"/>
+    <w:lsdException w:name="Light Grid Accent 6" w:uiPriority="62"/>
+    <w:lsdException w:name="Medium Shading 1 Accent 6" w:uiPriority="63"/>
+    <w:lsdException w:name="Medium Shading 2 Accent 6" w:uiPriority="64"/>
+    <w:lsdException w:name="Medium List 1 Accent 6" w:uiPriority="65"/>
+    <w:lsdException w:name="Medium List 2 Accent 6" w:uiPriority="66"/>
+    <w:lsdException w:name="Medium Grid 1 Accent 6" w:uiPriority="67"/>
+    <w:lsdException w:name="Medium Grid 2 Accent 6" w:uiPriority="68"/>
+    <w:lsdException w:name="Medium Grid 3 Accent 6" w:uiPriority="69"/>
+    <w:lsdException w:name="Dark List Accent 6" w:uiPriority="70"/>
+    <w:lsdException w:name="Colorful Shading Accent 6" w:uiPriority="71"/>
+    <w:lsdException w:name="Colorful List Accent 6" w:uiPriority="72"/>
+    <w:lsdException w:name="Colorful Grid Accent 6" w:uiPriority="73"/>
+    <w:lsdException w:name="Subtle Emphasis" w:uiPriority="19" w:qFormat="1"/>
+    <w:lsdException w:name="Intense Emphasis" w:uiPriority="21" w:qFormat="1"/>
+    <w:lsdException w:name="Subtle Reference" w:uiPriority="31" w:qFormat="1"/>
+    <w:lsdException w:name="Intense Reference" w:uiPriority="32" w:qFormat="1"/>
+    <w:lsdException w:name="Book Title" w:uiPriority="33" w:qFormat="1"/>
+    <w:lsdException w:name="Bibliography" w:semiHidden="1" w:uiPriority="37" w:unhideWhenUsed="1"/>
+    <w:lsdException w:name="TOC Heading" w:semiHidden="1" w:uiPriority="39" w:unhideWhenUsed="1" w:qFormat="1"/>
+    <w:lsdException w:name="Plain Table 1" w:uiPriority="41"/>
+    <w:lsdException w:name="Plain Table 2" w:uiPriority="42"/>
+    <w:lsdException w:name="Plain Table 3" w:uiPriority="43"/>
+    <w:lsdException w:name="Plain Table 4" w:uiPriority="44"/>
+    <w:lsdException w:name="Plain Table 5" w:uiPriority="45"/>
+    <w:lsdException w:name="Grid Table Light" w:uiPriority="40"/>
+    <w:lsdException w:name="Grid Table 1 Light" w:uiPriority="46"/>
+    <w:lsdException w:name="Grid Table 2" w:uiPriority="47"/>
+    <w:lsdException w:name="Grid Table 3" w:uiPriority="48"/>
+    <w:lsdException w:name="Grid Table 4" w:uiPriority="49"/>
+    <w:lsdException w:name="Grid Table 5 Dark" w:uiPriority="50"/>
+    <w:lsdException w:name="Grid Table 6 Colorful" w:uiPriority="51"/>
+    <w:lsdException w:name="Grid Table 7 Colorful" w:uiPriority="52"/>
+    <w:lsdException w:name="Grid Table 1 Light Accent 1" w:uiPriority="46"/>
+    <w:lsdException w:name="Grid Table 2 Accent 1" w:uiPriority="47"/>
+    <w:lsdException w:name="Grid Table 3 Accent 1" w:uiPriority="48"/>
+    <w:lsdException w:name="Grid Table 4 Accent 1" w:uiPriority="49"/>
+    <w:lsdException w:name="Grid Table 5 Dark Accent 1" w:uiPriority="50"/>
+    <w:lsdException w:name="Grid Table 6 Colorful Accent 1" w:uiPriority="51"/>
+    <w:lsdException w:name="Grid Table 7 Colorful Accent 1" w:uiPriority="52"/>
+    <w:lsdException w:name="Grid Table 1 Light Accent 2" w:uiPriority="46"/>
+    <w:lsdException w:name="Grid Table 2 Accent 2" w:uiPriority="47"/>
+    <w:lsdException w:name="Grid Table 3 Accent 2" w:uiPriority="48"/>
+    <w:lsdException w:name="Grid Table 4 Accent 2" w:uiPriority="49"/>
+    <w:lsdException w:name="Grid Table 5 Dark Accent 2" w:uiPriority="50"/>
+    <w:lsdException w:name="Grid Table 6 Colorful Accent 2" w:uiPriority="51"/>
+    <w:lsdException w:name="Grid Table 7 Colorful Accent 2" w:uiPriority="52"/>
+    <w:lsdException w:name="Grid Table 1 Light Accent 3" w:uiPriority="46"/>
+    <w:lsdException w:name="Grid Table 2 Accent 3" w:uiPriority="47"/>
+    <w:lsdException w:name="Grid Table 3 Accent 3" w:uiPriority="48"/>
+    <w:lsdException w:name="Grid Table 4 Accent 3" w:uiPriority="49"/>
+    <w:lsdException w:name="Grid Table 5 Dark Accent 3" w:uiPriority="50"/>
+    <w:lsdException w:name="Grid Table 6 Colorful Accent 3" w:uiPriority="51"/>
+    <w:lsdException w:name="Grid Table 7 Colorful Accent 3" w:uiPriority="52"/>
+    <w:lsdException w:name="Grid Table 1 Light Accent 4" w:uiPriority="46"/>
+    <w:lsdException w:name="Grid Table 2 Accent 4" w:uiPriority="47"/>
+    <w:lsdException w:name="Grid Table 3 Accent 4" w:uiPriority="48"/>
+    <w:lsdException w:name="Grid Table 4 Accent 4" w:uiPriority="49"/>
+    <w:lsdException w:name="Grid Table 5 Dark Accent 4" w:uiPriority="50"/>
+    <w:lsdException w:name="Grid Table 6 Colorful Accent 4" w:uiPriority="51"/>
+    <w:lsdException w:name="Grid Table 7 Colorful Accent 4" w:uiPriority="52"/>
+    <w:lsdException w:name="Grid Table 1 Light Accent 5" w:uiPriority="46"/>
+    <w:lsdException w:name="Grid Table 2 Accent 5" w:uiPriority="47"/>
+    <w:lsdException w:name="Grid Table 3 Accent 5" w:uiPriority="48"/>
+    <w:lsdException w:name="Grid Table 4 Accent 5" w:uiPriority="49"/>
+    <w:lsdException w:name="Grid Table 5 Dark Accent 5" w:uiPriority="50"/>
+    <w:lsdException w:name="Grid Table 6 Colorful Accent 5" w:uiPriority="51"/>
+    <w:lsdException w:name="Grid Table 7 Colorful Accent 5" w:uiPriority="52"/>
+    <w:lsdException w:name="Grid Table 1 Light Accent 6" w:uiPriority="46"/>
+    <w:lsdException w:name="Grid Table 2 Accent 6" w:uiPriority="47"/>
+    <w:lsdException w:name="Grid Table 3 Accent 6" w:uiPriority="48"/>
+    <w:lsdException w:name="Grid Table 4 Accent 6" w:uiPriority="49"/>
+    <w:lsdException w:name="Grid Table 5 Dark Accent 6" w:uiPriority="50"/>
+    <w:lsdException w:name="Grid Table 6 Colorful Accent 6" w:uiPriority="51"/>
+    <w:lsdException w:name="Grid Table 7 Colorful Accent 6" w:uiPriority="52"/>
+    <w:lsdException w:name="List Table 1 Light" w:uiPriority="46"/>
+    <w:lsdException w:name="List Table 2" w:uiPriority="47"/>
+    <w:lsdException w:name="List Table 3" w:uiPriority="48"/>
+    <w:lsdException w:name="List Table 4" w:uiPriority="49"/>
+    <w:lsdException w:name="List Table 5 Dark" w:uiPriority="50"/>
+    <w:lsdException w:name="List Table 6 Colorful" w:uiPriority="51"/>
+    <w:lsdException w:name="List Table 7 Colorful" w:uiPriority="52"/>
+    <w:lsdException w:name="List Table 1 Light Accent 1" w:uiPriority="46"/>
+    <w:lsdException w:name="List Table 2 Accent 1" w:uiPriority="47"/>
+    <w:lsdException w:name="List Table 3 Accent 1" w:uiPriority="48"/>
+    <w:lsdException w:name="List Table 4 Accent 1" w:uiPriority="49"/>
+    <w:lsdException w:name="List Table 5 Dark Accent 1" w:uiPriority="50"/>
+    <w:lsdException w:name="List Table 6 Colorful Accent 1" w:uiPriority="51"/>
+    <w:lsdException w:name="List Table 7 Colorful Accent 1" w:uiPriority="52"/>
+    <w:lsdException w:name="List Table 1 Light Accent 2" w:uiPriority="46"/>
+    <w:lsdException w:name="List Table 2 Accent 2" w:uiPriority="47"/>
+    <w:lsdException w:name="List Table 3 Accent 2" w:uiPriority="48"/>
+    <w:lsdException w:name="List Table 4 Accent 2" w:uiPriority="49"/>
+    <w:lsdException w:name="List Table 5 Dark Accent 2" w:uiPriority="50"/>
+    <w:lsdException w:name="List Table 6 Colorful Accent 2" w:uiPriority="51"/>
+    <w:lsdException w:name="List Table 7 Colorful Accent 2" w:uiPriority="52"/>
+    <w:lsdException w:name="List Table 1 Light Accent 3" w:uiPriority="46"/>
+    <w:lsdException w:name="List Table 2 Accent 3" w:uiPriority="47"/>
+    <w:lsdException w:name="List Table 3 Accent 3" w:uiPriority="48"/>
+    <w:lsdException w:name="List Table 4 Accent 3" w:uiPriority="49"/>
+    <w:lsdException w:name="List Table 5 Dark Accent 3" w:uiPriority="50"/>
+    <w:lsdException w:name="List Table 6 Colorful Accent 3" w:uiPriority="51"/>
+    <w:lsdException w:name="List Table 7 Colorful Accent 3" w:uiPriority="52"/>
+    <w:lsdException w:name="List Table 1 Light Accent 4" w:uiPriority="46"/>
+    <w:lsdException w:name="List Table 2 Accent 4" w:uiPriority="47"/>
+    <w:lsdException w:name="List Table 3 Accent 4" w:uiPriority="48"/>
+    <w:lsdException w:name="List Table 4 Accent 4" w:uiPriority="49"/>
+    <w:lsdException w:name="List Table 5 Dark Accent 4" w:uiPriority="50"/>
+    <w:lsdException w:name="List Table 6 Colorful Accent 4" w:uiPriority="51"/>
+    <w:lsdException w:name="List Table 7 Colorful Accent 4" w:uiPriority="52"/>
+    <w:lsdException w:name="List Table 1 Light Accent 5" w:uiPriority="46"/>
+    <w:lsdException w:name="List Table 2 Accent 5" w:uiPriority="47"/>
+    <w:lsdException w:name="List Table 3 Accent 5" w:uiPriority="48"/>
+    <w:lsdException w:name="List Table 4 Accent 5" w:uiPriority="49"/>
+    <w:lsdException w:name="List Table 5 Dark Accent 5" w:uiPriority="50"/>
+    <w:lsdException w:name="List Table 6 Colorful Accent 5" w:uiPriority="51"/>
+    <w:lsdException w:name="List Table 7 Colorful Accent 5" w:uiPriority="52"/>
+    <w:lsdException w:name="List Table 1 Light Accent 6" w:uiPriority="46"/>
+    <w:lsdException w:name="List Table 2 Accent 6" w:uiPriority="47"/>
+    <w:lsdException w:name="List Table 3 Accent 6" w:uiPriority="48"/>
+    <w:lsdException w:name="List Table 4 Accent 6" w:uiPriority="49"/>
+    <w:lsdException w:name="List Table 5 Dark Accent 6" w:uiPriority="50"/>
+    <w:lsdException w:name="List Table 6 Colorful Accent 6" w:uiPriority="51"/>
+    <w:lsdException w:name="List Table 7 Colorful Accent 6" w:uiPriority="52"/>
+  </w:latentStyles>
+  <w:style w:type="paragraph" w:default="1" w:styleId="Normal">
+    <w:name w:val="Normal"/>
+    <w:qFormat/>
+  </w:style>
+  <w:style w:type="character" w:default="1" w:styleId="DefaultParagraphFont">
+    <w:name w:val="Default Paragraph Font"/>
+    <w:uiPriority w:val="1"/>
+    <w:semiHidden/>
+    <w:unhideWhenUsed/>
+  </w:style>
+  <w:style w:type="table" w:default="1" w:styleId="TableNormal">
+    <w:name w:val="Normal Table"/>
+    <w:uiPriority w:val="99"/>
+    <w:semiHidden/>
+    <w:unhideWhenUsed/>
+    <w:tblPr>
+      <w:tblInd w:w="0" w:type="dxa"/>
+      <w:tblCellMar>
+        <w:top w:w="0" w:type="dxa"/>
+        <w:left w:w="108" w:type="dxa"/>
+        <w:bottom w:w="0" w:type="dxa"/>
+        <w:right w:w="108" w:type="dxa"/>
+      </w:tblCellMar>
+    </w:tblPr>
+  </w:style>
+  <w:style w:type="numbering" w:default="1" w:styleId="NoList">
+    <w:name w:val="No List"/>
+    <w:uiPriority w:val="99"/>
+    <w:semiHidden/>
+    <w:unhideWhenUsed/>
+  </w:style>
+  <w:style w:type="paragraph" w:customStyle="1" w:styleId="4F0775A49EAE4F23AF322B5B7AC7728B">
+    <w:name w:val="4F0775A49EAE4F23AF322B5B7AC7728B"/>
+    <w:rsid w:val="0000495E"/>
+  </w:style>
+  <w:style w:type="paragraph" w:customStyle="1" w:styleId="BAB9BC22E1304A3CBDDB31B21249F231">
+    <w:name w:val="BAB9BC22E1304A3CBDDB31B21249F231"/>
+    <w:rsid w:val="0000495E"/>
+  </w:style>
+  <w:style w:type="paragraph" w:customStyle="1" w:styleId="30E3C459B6D1491187442D4F7D1B7D93">
+    <w:name w:val="30E3C459B6D1491187442D4F7D1B7D93"/>
+    <w:rsid w:val="0000495E"/>
+  </w:style>
+</w:styles>
+</file>
+
+<file path=word/glossary/webSettings.xml><?xml version="1.0" encoding="utf-8"?>
+<w:webSettings xmlns:mc="http://schemas.openxmlformats.org/markup-compatibility/2006" xmlns:r="http://schemas.openxmlformats.org/officeDocument/2006/relationships" xmlns:w="http://schemas.openxmlformats.org/wordprocessingml/2006/main" xmlns:w14="http://schemas.microsoft.com/office/word/2010/wordml" xmlns:w15="http://schemas.microsoft.com/office/word/2012/wordml" xmlns:w16se="http://schemas.microsoft.com/office/word/2015/wordml/symex" mc:Ignorable="w14 w15 w16se">
+  <w:optimizeForBrowser/>
+  <w:allowPNG/>
+</w:webSettings>
 </file>
 
 <file path=word/theme/theme1.xml><?xml version="1.0" encoding="utf-8"?>

</xml_diff>